<commit_message>
Evaluate final models on the test split and add results to the report
- src/evaluate.py: scores localization, v1 and v3 once on the untouched test split
- report Section 8 and abstract use the test results (v3 score 0.702, building accuracy 80.8%)

Co-Authored-By: Claude Opus 5.5 <noreply@anthropic.com>
</commit_message>
<xml_diff>
--- a/docs/Hurricane_Damage_Mapper_Report.docx
+++ b/docs/Hurricane_Damage_Mapper_Report.docx
@@ -175,6 +175,29 @@
       </w:r>
       <w:r>
         <w:t xml:space="preserve"> and roughly doubled minor-damage F1 (to 0.45), at the cost of more false alarms on undamaged buildings; overall, 77.7% of buildings receive the correct damage level. A failed intermediate attempt showed how class weights trade neighbouring damage levels off against each other. The project also found that the georeferencing tags in the xBD GeoTIFF files are offset by 10 to 30 metres, and corrected this using the label coordinates.</w:t>
+      </w:r>
+    </w:p>
+    <w:p>
+      <w:r>
+        <w:t xml:space="preserve">On the untouched test split, the final model reaches a score of </w:t>
+      </w:r>
+      <w:r>
+        <w:rPr>
+          <w:b/>
+        </w:rPr>
+        <w:t>0.702</w:t>
+      </w:r>
+      <w:r>
+        <w:t xml:space="preserve"> (building localization F1 0.788) and assigns the correct damage level to </w:t>
+      </w:r>
+      <w:r>
+        <w:rPr>
+          <w:b/>
+        </w:rPr>
+        <w:t>80.8%</w:t>
+      </w:r>
+      <w:r>
+        <w:t xml:space="preserve"> of buildings.</w:t>
       </w:r>
     </w:p>
     <w:p>
@@ -2965,7 +2988,7 @@
     </w:p>
     <w:p>
       <w:r>
-        <w:t xml:space="preserve">All results in this section are on the </w:t>
+        <w:t xml:space="preserve">All results in this section and in Section 7 are on the </w:t>
       </w:r>
       <w:r>
         <w:rPr>
@@ -2974,7 +2997,7 @@
         <w:t>hold</w:t>
       </w:r>
       <w:r>
-        <w:t xml:space="preserve"> split, which was used to choose the best training epoch. They may therefore be slightly optimistic; the untouched </w:t>
+        <w:t xml:space="preserve"> split, which was used to choose the best training epoch. They may therefore be slightly optimistic; the final results on the untouched </w:t>
       </w:r>
       <w:r>
         <w:rPr>
@@ -2983,7 +3006,7 @@
         <w:t>test</w:t>
       </w:r>
       <w:r>
-        <w:t xml:space="preserve"> split is reserved for the final evaluation.</w:t>
+        <w:t xml:space="preserve"> split are in Section 8.</w:t>
       </w:r>
     </w:p>
     <w:p>
@@ -6381,545 +6404,22 @@
         <w:pStyle w:val="Heading1"/>
       </w:pPr>
       <w:r>
-        <w:t>8. Discussion and Limitations</w:t>
-      </w:r>
-    </w:p>
-    <w:p>
-      <w:pPr>
-        <w:pStyle w:val="ListBullet"/>
-      </w:pPr>
-      <w:r>
-        <w:rPr>
-          <w:b/>
-        </w:rPr>
-        <w:t>Minor damage is hard to see.</w:t>
-      </w:r>
-      <w:r>
-        <w:t xml:space="preserve"> At about 0.5 m per pixel, the difference between no, minor and major damage is often a few pixels. Even human labellers disagree most on this level.</w:t>
-      </w:r>
-    </w:p>
-    <w:p>
-      <w:pPr>
-        <w:pStyle w:val="ListBullet"/>
-      </w:pPr>
-      <w:r>
-        <w:rPr>
-          <w:b/>
-        </w:rPr>
-        <w:t>Touching buildings are merged.</w:t>
-      </w:r>
-      <w:r>
-        <w:t xml:space="preserve"> Buildings are separated by finding connected regions, so adjacent houses become one predicted building. Top xView2 solutions split them with additional steps such as watershed segmentation.</w:t>
-      </w:r>
-    </w:p>
-    <w:p>
-      <w:pPr>
-        <w:pStyle w:val="ListBullet"/>
-      </w:pPr>
-      <w:r>
-        <w:rPr>
-          <w:b/>
-        </w:rPr>
-        <w:t>Domain shift.</w:t>
-      </w:r>
-      <w:r>
-        <w:t xml:space="preserve"> The training data is mostly US suburbs; performance drops on very different settlements (Haiti).</w:t>
-      </w:r>
-    </w:p>
-    <w:p>
-      <w:pPr>
-        <w:pStyle w:val="ListBullet"/>
-      </w:pPr>
-      <w:r>
-        <w:rPr>
-          <w:b/>
-        </w:rPr>
-        <w:t>Validation-based results.</w:t>
-      </w:r>
-      <w:r>
-        <w:t xml:space="preserve"> Results are on the hold split, which was used to pick the best epoch. The final numbers must come from the test split.</w:t>
-      </w:r>
-    </w:p>
-    <w:p>
-      <w:pPr>
-        <w:pStyle w:val="ListBullet"/>
-      </w:pPr>
-      <w:r>
-        <w:rPr>
-          <w:b/>
-        </w:rPr>
-        <w:t>Single runs and combined changes.</w:t>
-      </w:r>
-      <w:r>
-        <w:t xml:space="preserve"> Each configuration was trained once, so differences of a few points may partly be run-to-run noise. v3 changed several things at once (starting point, data, weights, learning rate), so its improvement cannot be attributed to any single change.</w:t>
-      </w:r>
-    </w:p>
-    <w:p>
-      <w:pPr>
-        <w:pStyle w:val="ListBullet"/>
-      </w:pPr>
-      <w:r>
-        <w:rPr>
-          <w:b/>
-        </w:rPr>
-        <w:t>Simple architecture.</w:t>
-      </w:r>
-      <w:r>
-        <w:t xml:space="preserve"> A 6-channel U-Net is simpler than the Siamese networks and ensembles used by top solutions.</w:t>
-      </w:r>
-    </w:p>
-    <w:p>
-      <w:pPr>
-        <w:pStyle w:val="Heading1"/>
-      </w:pPr>
-      <w:r>
-        <w:t>9. Conclusion and Future Work</w:t>
-      </w:r>
-    </w:p>
-    <w:p>
-      <w:r>
-        <w:t>This project delivered a complete, working system for building damage assessment after hurricanes: from raw satellite data, through two trained models, to an interactive map. Trained on a single laptop, it finds buildings with a pixel F1 of 0.792, reaches a damage score of 0.711 and assigns the correct damage level to 77.7% of buildings. Minor damage remains the hardest level, but fine-tuning with balanced weights and more data roughly doubled its F1. Along the way the project identified and corrected a georeferencing error in the dataset's GeoTIFF metadata.</w:t>
-      </w:r>
-    </w:p>
-    <w:p>
-      <w:r>
-        <w:t>Future work, roughly in order of expected benefit:</w:t>
-      </w:r>
-    </w:p>
-    <w:p>
-      <w:pPr>
-        <w:pStyle w:val="ListBullet"/>
-      </w:pPr>
-      <w:r>
-        <w:t>Final evaluation on the untouched test split.</w:t>
-      </w:r>
-    </w:p>
-    <w:p>
-      <w:pPr>
-        <w:pStyle w:val="ListBullet"/>
-      </w:pPr>
-      <w:r>
-        <w:t>A Siamese architecture that processes before and after images with a shared encoder.</w:t>
-      </w:r>
-    </w:p>
-    <w:p>
-      <w:pPr>
-        <w:pStyle w:val="ListBullet"/>
-      </w:pPr>
-      <w:r>
-        <w:t>Separating touching buildings (for example with watershed segmentation).</w:t>
-      </w:r>
-    </w:p>
-    <w:p>
-      <w:pPr>
-        <w:pStyle w:val="ListBullet"/>
-      </w:pPr>
-      <w:r>
-        <w:t>Ensembles and test-time augmentation (averaging predictions over flipped and rotated inputs).</w:t>
-      </w:r>
-    </w:p>
-    <w:p>
-      <w:pPr>
-        <w:pStyle w:val="ListBullet"/>
-      </w:pPr>
-      <w:r>
-        <w:t>Fine-tuning on data from the region of interest to reduce domain shift.</w:t>
-      </w:r>
-    </w:p>
-    <w:p>
-      <w:pPr>
-        <w:pStyle w:val="Heading1"/>
-      </w:pPr>
-      <w:r>
-        <w:t>References</w:t>
-      </w:r>
-    </w:p>
-    <w:p>
-      <w:r>
-        <w:t>Gupta, R., Goodman, B., Patel, N., Hosfelt, R., Sajeev, S., Heim, E., Doshi, J., Lucas, K., Choset, H., &amp; Gaston, M. (2019). Creating xBD: A dataset for assessing building damage from satellite imagery. CVPR Workshops.</w:t>
-      </w:r>
-    </w:p>
-    <w:p>
-      <w:r>
-        <w:t>Ronneberger, O., Fischer, P., &amp; Brox, T. (2015). U-Net: Convolutional networks for biomedical image segmentation. MICCAI.</w:t>
-      </w:r>
-    </w:p>
-    <w:p>
-      <w:r>
-        <w:t>He, K., Zhang, X., Ren, S., &amp; Sun, J. (2016). Deep residual learning for image recognition. CVPR.</w:t>
-      </w:r>
-    </w:p>
-    <w:p>
-      <w:r>
-        <w:t>Iakubovskii, P. (2019). Segmentation Models PyTorch. GitHub repository, qubvel/segmentation_models.pytorch.</w:t>
-      </w:r>
-    </w:p>
-    <w:p>
-      <w:r>
-        <w:t>xView2 challenge: Computer vision for building damage assessment. https://xview2.org</w:t>
-      </w:r>
-    </w:p>
-    <w:p>
-      <w:r>
-        <w:br w:type="page"/>
-      </w:r>
-    </w:p>
-    <w:p>
-      <w:pPr>
-        <w:pStyle w:val="Heading1"/>
-      </w:pPr>
-      <w:r>
-        <w:t>Part B — Code Walkthrough</w:t>
-      </w:r>
-    </w:p>
-    <w:p>
-      <w:r>
-        <w:t>This part explains how the code is organized and what each file does, with the most important functions shown in full. Code excerpts are copied automatically from the source files when this report is built.</w:t>
-      </w:r>
-    </w:p>
-    <w:p>
-      <w:pPr>
-        <w:pStyle w:val="Heading2"/>
-      </w:pPr>
-      <w:r>
-        <w:t>B.1 Project structure</w:t>
-      </w:r>
-    </w:p>
-    <w:p>
-      <w:pPr>
-        <w:spacing w:after="0" w:line="240" w:lineRule="auto"/>
-        <w:shd w:val="clear" w:color="auto" w:fill="F3F4F6"/>
-      </w:pPr>
-      <w:r>
-        <w:rPr>
-          <w:rFonts w:ascii="Consolas" w:hAnsi="Consolas"/>
-          <w:sz w:val="17"/>
-        </w:rPr>
-        <w:t>fyp/</w:t>
-      </w:r>
-    </w:p>
-    <w:p>
-      <w:pPr>
-        <w:spacing w:after="0" w:line="240" w:lineRule="auto"/>
-        <w:shd w:val="clear" w:color="auto" w:fill="F3F4F6"/>
-      </w:pPr>
-      <w:r>
-        <w:rPr>
-          <w:rFonts w:ascii="Consolas" w:hAnsi="Consolas"/>
-          <w:sz w:val="17"/>
-        </w:rPr>
-        <w:t>├── README.md               setup, commands and results summary</w:t>
-      </w:r>
-    </w:p>
-    <w:p>
-      <w:pPr>
-        <w:spacing w:after="0" w:line="240" w:lineRule="auto"/>
-        <w:shd w:val="clear" w:color="auto" w:fill="F3F4F6"/>
-      </w:pPr>
-      <w:r>
-        <w:rPr>
-          <w:rFonts w:ascii="Consolas" w:hAnsi="Consolas"/>
-          <w:sz w:val="17"/>
-        </w:rPr>
-        <w:t>├── requirements.txt        Python libraries</w:t>
-      </w:r>
-    </w:p>
-    <w:p>
-      <w:pPr>
-        <w:spacing w:after="0" w:line="240" w:lineRule="auto"/>
-        <w:shd w:val="clear" w:color="auto" w:fill="F3F4F6"/>
-      </w:pPr>
-      <w:r>
-        <w:rPr>
-          <w:rFonts w:ascii="Consolas" w:hAnsi="Consolas"/>
-          <w:sz w:val="17"/>
-        </w:rPr>
-        <w:t>├── src/                    all Python code</w:t>
-      </w:r>
-    </w:p>
-    <w:p>
-      <w:pPr>
-        <w:spacing w:after="0" w:line="240" w:lineRule="auto"/>
-        <w:shd w:val="clear" w:color="auto" w:fill="F3F4F6"/>
-      </w:pPr>
-      <w:r>
-        <w:rPr>
-          <w:rFonts w:ascii="Consolas" w:hAnsi="Consolas"/>
-          <w:sz w:val="17"/>
-        </w:rPr>
-        <w:t>│   ├── xbd.py              reading raw xBD files</w:t>
-      </w:r>
-    </w:p>
-    <w:p>
-      <w:pPr>
-        <w:spacing w:after="0" w:line="240" w:lineRule="auto"/>
-        <w:shd w:val="clear" w:color="auto" w:fill="F3F4F6"/>
-      </w:pPr>
-      <w:r>
-        <w:rPr>
-          <w:rFonts w:ascii="Consolas" w:hAnsi="Consolas"/>
-          <w:sz w:val="17"/>
-        </w:rPr>
-        <w:t>│   ├── preprocess.py       raw GeoTIFFs -&gt; JPEG images + masks</w:t>
-      </w:r>
-    </w:p>
-    <w:p>
-      <w:pPr>
-        <w:spacing w:after="0" w:line="240" w:lineRule="auto"/>
-        <w:shd w:val="clear" w:color="auto" w:fill="F3F4F6"/>
-      </w:pPr>
-      <w:r>
-        <w:rPr>
-          <w:rFonts w:ascii="Consolas" w:hAnsi="Consolas"/>
-          <w:sz w:val="17"/>
-        </w:rPr>
-        <w:t>│   ├── dataset.py          feeding images to the localization model</w:t>
-      </w:r>
-    </w:p>
-    <w:p>
-      <w:pPr>
-        <w:spacing w:after="0" w:line="240" w:lineRule="auto"/>
-        <w:shd w:val="clear" w:color="auto" w:fill="F3F4F6"/>
-      </w:pPr>
-      <w:r>
-        <w:rPr>
-          <w:rFonts w:ascii="Consolas" w:hAnsi="Consolas"/>
-          <w:sz w:val="17"/>
-        </w:rPr>
-        <w:t>│   ├── train.py            localization model: training and scoring</w:t>
-      </w:r>
-    </w:p>
-    <w:p>
-      <w:pPr>
-        <w:spacing w:after="0" w:line="240" w:lineRule="auto"/>
-        <w:shd w:val="clear" w:color="auto" w:fill="F3F4F6"/>
-      </w:pPr>
-      <w:r>
-        <w:rPr>
-          <w:rFonts w:ascii="Consolas" w:hAnsi="Consolas"/>
-          <w:sz w:val="17"/>
-        </w:rPr>
-        <w:t>│   ├── damage.py           damage model: data, training and scoring</w:t>
-      </w:r>
-    </w:p>
-    <w:p>
-      <w:pPr>
-        <w:spacing w:after="0" w:line="240" w:lineRule="auto"/>
-        <w:shd w:val="clear" w:color="auto" w:fill="F3F4F6"/>
-      </w:pPr>
-      <w:r>
-        <w:rPr>
-          <w:rFonts w:ascii="Consolas" w:hAnsi="Consolas"/>
-          <w:sz w:val="17"/>
-        </w:rPr>
-        <w:t>│   ├── predict.py          both models -&gt; buildings on the map</w:t>
-      </w:r>
-    </w:p>
-    <w:p>
-      <w:pPr>
-        <w:spacing w:after="0" w:line="240" w:lineRule="auto"/>
-        <w:shd w:val="clear" w:color="auto" w:fill="F3F4F6"/>
-      </w:pPr>
-      <w:r>
-        <w:rPr>
-          <w:rFonts w:ascii="Consolas" w:hAnsi="Consolas"/>
-          <w:sz w:val="17"/>
-        </w:rPr>
-        <w:t>│   └── progress.py         live training progress in the terminal</w:t>
-      </w:r>
-    </w:p>
-    <w:p>
-      <w:pPr>
-        <w:spacing w:after="0" w:line="240" w:lineRule="auto"/>
-        <w:shd w:val="clear" w:color="auto" w:fill="F3F4F6"/>
-      </w:pPr>
-      <w:r>
-        <w:rPr>
-          <w:rFonts w:ascii="Consolas" w:hAnsi="Consolas"/>
-          <w:sz w:val="17"/>
-        </w:rPr>
-        <w:t>├── notebooks/</w:t>
-      </w:r>
-    </w:p>
-    <w:p>
-      <w:pPr>
-        <w:spacing w:after="0" w:line="240" w:lineRule="auto"/>
-        <w:shd w:val="clear" w:color="auto" w:fill="F3F4F6"/>
-      </w:pPr>
-      <w:r>
-        <w:rPr>
-          <w:rFonts w:ascii="Consolas" w:hAnsi="Consolas"/>
-          <w:sz w:val="17"/>
-        </w:rPr>
-        <w:t>│   ├── 01_explore_xbd.ipynb             dataset exploration</w:t>
-      </w:r>
-    </w:p>
-    <w:p>
-      <w:pPr>
-        <w:spacing w:after="0" w:line="240" w:lineRule="auto"/>
-        <w:shd w:val="clear" w:color="auto" w:fill="F3F4F6"/>
-      </w:pPr>
-      <w:r>
-        <w:rPr>
-          <w:rFonts w:ascii="Consolas" w:hAnsi="Consolas"/>
-          <w:sz w:val="17"/>
-        </w:rPr>
-        <w:t>│   ├── 02_building_localization.ipynb   localization results</w:t>
-      </w:r>
-    </w:p>
-    <w:p>
-      <w:pPr>
-        <w:spacing w:after="0" w:line="240" w:lineRule="auto"/>
-        <w:shd w:val="clear" w:color="auto" w:fill="F3F4F6"/>
-      </w:pPr>
-      <w:r>
-        <w:rPr>
-          <w:rFonts w:ascii="Consolas" w:hAnsi="Consolas"/>
-          <w:sz w:val="17"/>
-        </w:rPr>
-        <w:t>│   └── 03_damage_classification.ipynb   damage results</w:t>
-      </w:r>
-    </w:p>
-    <w:p>
-      <w:pPr>
-        <w:spacing w:after="0" w:line="240" w:lineRule="auto"/>
-        <w:shd w:val="clear" w:color="auto" w:fill="F3F4F6"/>
-      </w:pPr>
-      <w:r>
-        <w:rPr>
-          <w:rFonts w:ascii="Consolas" w:hAnsi="Consolas"/>
-          <w:sz w:val="17"/>
-        </w:rPr>
-        <w:t>├── dashboard/</w:t>
-      </w:r>
-    </w:p>
-    <w:p>
-      <w:pPr>
-        <w:spacing w:after="0" w:line="240" w:lineRule="auto"/>
-        <w:shd w:val="clear" w:color="auto" w:fill="F3F4F6"/>
-      </w:pPr>
-      <w:r>
-        <w:rPr>
-          <w:rFonts w:ascii="Consolas" w:hAnsi="Consolas"/>
-          <w:sz w:val="17"/>
-        </w:rPr>
-        <w:t>│   ├── index.html          the map web page</w:t>
-      </w:r>
-    </w:p>
-    <w:p>
-      <w:pPr>
-        <w:spacing w:after="0" w:line="240" w:lineRule="auto"/>
-        <w:shd w:val="clear" w:color="auto" w:fill="F3F4F6"/>
-      </w:pPr>
-      <w:r>
-        <w:rPr>
-          <w:rFonts w:ascii="Consolas" w:hAnsi="Consolas"/>
-          <w:sz w:val="17"/>
-        </w:rPr>
-        <w:t>│   ├── data/               exported buildings (generated)</w:t>
-      </w:r>
-    </w:p>
-    <w:p>
-      <w:pPr>
-        <w:spacing w:after="0" w:line="240" w:lineRule="auto"/>
-        <w:shd w:val="clear" w:color="auto" w:fill="F3F4F6"/>
-      </w:pPr>
-      <w:r>
-        <w:rPr>
-          <w:rFonts w:ascii="Consolas" w:hAnsi="Consolas"/>
-          <w:sz w:val="17"/>
-        </w:rPr>
-        <w:t>│   └── images/             tile images for the map (generated)</w:t>
-      </w:r>
-    </w:p>
-    <w:p>
-      <w:pPr>
-        <w:spacing w:after="0" w:line="240" w:lineRule="auto"/>
-        <w:shd w:val="clear" w:color="auto" w:fill="F3F4F6"/>
-      </w:pPr>
-      <w:r>
-        <w:rPr>
-          <w:rFonts w:ascii="Consolas" w:hAnsi="Consolas"/>
-          <w:sz w:val="17"/>
-        </w:rPr>
-        <w:t>├── docs/                   this report and its figures</w:t>
-      </w:r>
-    </w:p>
-    <w:p>
-      <w:pPr>
-        <w:spacing w:after="0" w:line="240" w:lineRule="auto"/>
-        <w:shd w:val="clear" w:color="auto" w:fill="F3F4F6"/>
-      </w:pPr>
-      <w:r>
-        <w:rPr>
-          <w:rFonts w:ascii="Consolas" w:hAnsi="Consolas"/>
-          <w:sz w:val="17"/>
-        </w:rPr>
-        <w:t>├── data/                   dataset: raw xbd/ and processed/ (not in git)</w:t>
-      </w:r>
-    </w:p>
-    <w:p>
-      <w:pPr>
-        <w:spacing w:after="0" w:line="240" w:lineRule="auto"/>
-        <w:shd w:val="clear" w:color="auto" w:fill="F3F4F6"/>
-      </w:pPr>
-      <w:r>
-        <w:rPr>
-          <w:rFonts w:ascii="Consolas" w:hAnsi="Consolas"/>
-          <w:sz w:val="17"/>
-        </w:rPr>
-        <w:t>├── runs/                   trained models and logs (not in git)</w:t>
-      </w:r>
-    </w:p>
-    <w:p>
-      <w:pPr>
-        <w:spacing w:after="0" w:line="240" w:lineRule="auto"/>
-        <w:shd w:val="clear" w:color="auto" w:fill="F3F4F6"/>
-      </w:pPr>
-      <w:r>
-        <w:rPr>
-          <w:rFonts w:ascii="Consolas" w:hAnsi="Consolas"/>
-          <w:sz w:val="17"/>
-        </w:rPr>
-        <w:t>└── outputs/                charts and tables from notebook 01</w:t>
-      </w:r>
-    </w:p>
-    <w:p>
-      <w:pPr>
-        <w:spacing w:after="40"/>
-      </w:pPr>
-    </w:p>
-    <w:p>
-      <w:pPr>
-        <w:pStyle w:val="Heading2"/>
-      </w:pPr>
-      <w:r>
-        <w:t>B.2 Running the project from scratch</w:t>
-      </w:r>
-    </w:p>
-    <w:p>
-      <w:r>
-        <w:t>All commands run from the project folder with Anaconda's Python (</w:t>
+        <w:t>8. Final Evaluation on the Test Split</w:t>
+      </w:r>
+    </w:p>
+    <w:p>
+      <w:r>
+        <w:t xml:space="preserve">Every run used the hold split to choose its best epoch, and the v2 and v3 designs were chosen after looking at hold results, so hold scores are slightly optimistic. The test split (933 tiles) was never used for any decision. The localization model, v1 and the final model v3 were each evaluated on it once, with </w:t>
       </w:r>
       <w:r>
         <w:rPr>
           <w:rFonts w:ascii="Consolas" w:hAnsi="Consolas"/>
           <w:sz w:val="19"/>
         </w:rPr>
-        <w:t>/opt/anaconda3/bin/python3</w:t>
-      </w:r>
-      <w:r>
-        <w:t xml:space="preserve">, written </w:t>
-      </w:r>
-      <w:r>
-        <w:rPr>
-          <w:rFonts w:ascii="Consolas" w:hAnsi="Consolas"/>
-          <w:sz w:val="19"/>
-        </w:rPr>
-        <w:t>python</w:t>
-      </w:r>
-      <w:r>
-        <w:t xml:space="preserve"> below):</w:t>
+        <w:t>src/evaluate.py</w:t>
+      </w:r>
+      <w:r>
+        <w:t>.</w:t>
       </w:r>
     </w:p>
     <w:p>
@@ -6940,7 +6440,833 @@
           <w:color w:val="555F6D"/>
           <w:sz w:val="19"/>
         </w:rPr>
-        <w:t>Commands in order.</w:t>
+        <w:t>Damage models on the test split, with the hold result of v3 for comparison.</w:t>
+      </w:r>
+    </w:p>
+    <w:tbl>
+      <w:tblPr>
+        <w:tblStyle w:val="TableGrid"/>
+        <w:tblW w:type="auto" w:w="0"/>
+        <w:jc w:val="center"/>
+        <w:tblLook w:firstColumn="1" w:firstRow="1" w:lastColumn="0" w:lastRow="0" w:noHBand="0" w:noVBand="1" w:val="04A0"/>
+      </w:tblPr>
+      <w:tblGrid>
+        <w:gridCol w:w="2340"/>
+        <w:gridCol w:w="2340"/>
+        <w:gridCol w:w="2340"/>
+        <w:gridCol w:w="2340"/>
+      </w:tblGrid>
+      <w:tr>
+        <w:tc>
+          <w:tcPr>
+            <w:tcW w:type="dxa" w:w="3456"/>
+            <w:shd w:val="clear" w:color="auto" w:fill="DCE6F2"/>
+          </w:tcPr>
+          <w:p>
+            <w:pPr>
+              <w:spacing w:after="40"/>
+            </w:pPr>
+            <w:r/>
+            <w:r>
+              <w:rPr>
+                <w:b/>
+                <w:sz w:val="20"/>
+              </w:rPr>
+              <w:t>Metric</w:t>
+            </w:r>
+          </w:p>
+        </w:tc>
+        <w:tc>
+          <w:tcPr>
+            <w:tcW w:type="dxa" w:w="1728"/>
+            <w:shd w:val="clear" w:color="auto" w:fill="DCE6F2"/>
+          </w:tcPr>
+          <w:p>
+            <w:pPr>
+              <w:spacing w:after="40"/>
+            </w:pPr>
+            <w:r/>
+            <w:r>
+              <w:rPr>
+                <w:b/>
+                <w:sz w:val="20"/>
+              </w:rPr>
+              <w:t>Hold (v3)</w:t>
+            </w:r>
+          </w:p>
+        </w:tc>
+        <w:tc>
+          <w:tcPr>
+            <w:tcW w:type="dxa" w:w="1728"/>
+            <w:shd w:val="clear" w:color="auto" w:fill="DCE6F2"/>
+          </w:tcPr>
+          <w:p>
+            <w:pPr>
+              <w:spacing w:after="40"/>
+            </w:pPr>
+            <w:r/>
+            <w:r>
+              <w:rPr>
+                <w:b/>
+                <w:sz w:val="20"/>
+              </w:rPr>
+              <w:t>Test (v1)</w:t>
+            </w:r>
+          </w:p>
+        </w:tc>
+        <w:tc>
+          <w:tcPr>
+            <w:tcW w:type="dxa" w:w="2160"/>
+            <w:shd w:val="clear" w:color="auto" w:fill="DCE6F2"/>
+          </w:tcPr>
+          <w:p>
+            <w:pPr>
+              <w:spacing w:after="40"/>
+            </w:pPr>
+            <w:r/>
+            <w:r>
+              <w:rPr>
+                <w:b/>
+                <w:sz w:val="20"/>
+              </w:rPr>
+              <w:t>Test (v3, final)</w:t>
+            </w:r>
+          </w:p>
+        </w:tc>
+      </w:tr>
+      <w:tr>
+        <w:tc>
+          <w:tcPr>
+            <w:tcW w:type="dxa" w:w="3456"/>
+          </w:tcPr>
+          <w:p>
+            <w:pPr>
+              <w:spacing w:after="40"/>
+            </w:pPr>
+            <w:r>
+              <w:rPr>
+                <w:sz w:val="20"/>
+              </w:rPr>
+            </w:r>
+            <w:r>
+              <w:rPr>
+                <w:sz w:val="20"/>
+              </w:rPr>
+              <w:t>Score</w:t>
+            </w:r>
+          </w:p>
+        </w:tc>
+        <w:tc>
+          <w:tcPr>
+            <w:tcW w:type="dxa" w:w="1728"/>
+          </w:tcPr>
+          <w:p>
+            <w:pPr>
+              <w:spacing w:after="40"/>
+              <w:jc w:val="right"/>
+            </w:pPr>
+            <w:r>
+              <w:rPr>
+                <w:sz w:val="20"/>
+              </w:rPr>
+            </w:r>
+            <w:r>
+              <w:rPr>
+                <w:sz w:val="20"/>
+              </w:rPr>
+              <w:t>0.711</w:t>
+            </w:r>
+          </w:p>
+        </w:tc>
+        <w:tc>
+          <w:tcPr>
+            <w:tcW w:type="dxa" w:w="1728"/>
+          </w:tcPr>
+          <w:p>
+            <w:pPr>
+              <w:spacing w:after="40"/>
+              <w:jc w:val="right"/>
+            </w:pPr>
+            <w:r>
+              <w:rPr>
+                <w:sz w:val="20"/>
+              </w:rPr>
+            </w:r>
+            <w:r>
+              <w:rPr>
+                <w:sz w:val="20"/>
+              </w:rPr>
+              <w:t>0.584</w:t>
+            </w:r>
+          </w:p>
+        </w:tc>
+        <w:tc>
+          <w:tcPr>
+            <w:tcW w:type="dxa" w:w="2160"/>
+          </w:tcPr>
+          <w:p>
+            <w:pPr>
+              <w:spacing w:after="40"/>
+              <w:jc w:val="right"/>
+            </w:pPr>
+            <w:r>
+              <w:rPr>
+                <w:sz w:val="20"/>
+              </w:rPr>
+            </w:r>
+            <w:r>
+              <w:rPr>
+                <w:sz w:val="20"/>
+              </w:rPr>
+              <w:t>0.702</w:t>
+            </w:r>
+          </w:p>
+        </w:tc>
+      </w:tr>
+      <w:tr>
+        <w:tc>
+          <w:tcPr>
+            <w:tcW w:type="dxa" w:w="3456"/>
+          </w:tcPr>
+          <w:p>
+            <w:pPr>
+              <w:spacing w:after="40"/>
+            </w:pPr>
+            <w:r>
+              <w:rPr>
+                <w:sz w:val="20"/>
+              </w:rPr>
+            </w:r>
+            <w:r>
+              <w:rPr>
+                <w:sz w:val="20"/>
+              </w:rPr>
+              <w:t>Localization F1</w:t>
+            </w:r>
+          </w:p>
+        </w:tc>
+        <w:tc>
+          <w:tcPr>
+            <w:tcW w:type="dxa" w:w="1728"/>
+          </w:tcPr>
+          <w:p>
+            <w:pPr>
+              <w:spacing w:after="40"/>
+              <w:jc w:val="right"/>
+            </w:pPr>
+            <w:r>
+              <w:rPr>
+                <w:sz w:val="20"/>
+              </w:rPr>
+            </w:r>
+            <w:r>
+              <w:rPr>
+                <w:sz w:val="20"/>
+              </w:rPr>
+              <w:t>0.821</w:t>
+            </w:r>
+          </w:p>
+        </w:tc>
+        <w:tc>
+          <w:tcPr>
+            <w:tcW w:type="dxa" w:w="1728"/>
+          </w:tcPr>
+          <w:p>
+            <w:pPr>
+              <w:spacing w:after="40"/>
+              <w:jc w:val="right"/>
+            </w:pPr>
+            <w:r>
+              <w:rPr>
+                <w:sz w:val="20"/>
+              </w:rPr>
+            </w:r>
+            <w:r>
+              <w:rPr>
+                <w:sz w:val="20"/>
+              </w:rPr>
+              <w:t>0.820</w:t>
+            </w:r>
+          </w:p>
+        </w:tc>
+        <w:tc>
+          <w:tcPr>
+            <w:tcW w:type="dxa" w:w="2160"/>
+          </w:tcPr>
+          <w:p>
+            <w:pPr>
+              <w:spacing w:after="40"/>
+              <w:jc w:val="right"/>
+            </w:pPr>
+            <w:r>
+              <w:rPr>
+                <w:sz w:val="20"/>
+              </w:rPr>
+            </w:r>
+            <w:r>
+              <w:rPr>
+                <w:sz w:val="20"/>
+              </w:rPr>
+              <w:t>0.822</w:t>
+            </w:r>
+          </w:p>
+        </w:tc>
+      </w:tr>
+      <w:tr>
+        <w:tc>
+          <w:tcPr>
+            <w:tcW w:type="dxa" w:w="3456"/>
+          </w:tcPr>
+          <w:p>
+            <w:pPr>
+              <w:spacing w:after="40"/>
+            </w:pPr>
+            <w:r>
+              <w:rPr>
+                <w:sz w:val="20"/>
+              </w:rPr>
+            </w:r>
+            <w:r>
+              <w:rPr>
+                <w:sz w:val="20"/>
+              </w:rPr>
+              <w:t>Damage F1</w:t>
+            </w:r>
+          </w:p>
+        </w:tc>
+        <w:tc>
+          <w:tcPr>
+            <w:tcW w:type="dxa" w:w="1728"/>
+          </w:tcPr>
+          <w:p>
+            <w:pPr>
+              <w:spacing w:after="40"/>
+              <w:jc w:val="right"/>
+            </w:pPr>
+            <w:r>
+              <w:rPr>
+                <w:sz w:val="20"/>
+              </w:rPr>
+            </w:r>
+            <w:r>
+              <w:rPr>
+                <w:sz w:val="20"/>
+              </w:rPr>
+              <w:t>0.664</w:t>
+            </w:r>
+          </w:p>
+        </w:tc>
+        <w:tc>
+          <w:tcPr>
+            <w:tcW w:type="dxa" w:w="1728"/>
+          </w:tcPr>
+          <w:p>
+            <w:pPr>
+              <w:spacing w:after="40"/>
+              <w:jc w:val="right"/>
+            </w:pPr>
+            <w:r>
+              <w:rPr>
+                <w:sz w:val="20"/>
+              </w:rPr>
+            </w:r>
+            <w:r>
+              <w:rPr>
+                <w:sz w:val="20"/>
+              </w:rPr>
+              <w:t>0.483</w:t>
+            </w:r>
+          </w:p>
+        </w:tc>
+        <w:tc>
+          <w:tcPr>
+            <w:tcW w:type="dxa" w:w="2160"/>
+          </w:tcPr>
+          <w:p>
+            <w:pPr>
+              <w:spacing w:after="40"/>
+              <w:jc w:val="right"/>
+            </w:pPr>
+            <w:r>
+              <w:rPr>
+                <w:sz w:val="20"/>
+              </w:rPr>
+            </w:r>
+            <w:r>
+              <w:rPr>
+                <w:sz w:val="20"/>
+              </w:rPr>
+              <w:t>0.651</w:t>
+            </w:r>
+          </w:p>
+        </w:tc>
+      </w:tr>
+      <w:tr>
+        <w:tc>
+          <w:tcPr>
+            <w:tcW w:type="dxa" w:w="3456"/>
+          </w:tcPr>
+          <w:p>
+            <w:pPr>
+              <w:spacing w:after="40"/>
+            </w:pPr>
+            <w:r>
+              <w:rPr>
+                <w:sz w:val="20"/>
+              </w:rPr>
+            </w:r>
+            <w:r>
+              <w:rPr>
+                <w:sz w:val="20"/>
+              </w:rPr>
+              <w:t>F1 — no damage</w:t>
+            </w:r>
+          </w:p>
+        </w:tc>
+        <w:tc>
+          <w:tcPr>
+            <w:tcW w:type="dxa" w:w="1728"/>
+          </w:tcPr>
+          <w:p>
+            <w:pPr>
+              <w:spacing w:after="40"/>
+              <w:jc w:val="right"/>
+            </w:pPr>
+            <w:r>
+              <w:rPr>
+                <w:sz w:val="20"/>
+              </w:rPr>
+            </w:r>
+            <w:r>
+              <w:rPr>
+                <w:sz w:val="20"/>
+              </w:rPr>
+              <w:t>0.911</w:t>
+            </w:r>
+          </w:p>
+        </w:tc>
+        <w:tc>
+          <w:tcPr>
+            <w:tcW w:type="dxa" w:w="1728"/>
+          </w:tcPr>
+          <w:p>
+            <w:pPr>
+              <w:spacing w:after="40"/>
+              <w:jc w:val="right"/>
+            </w:pPr>
+            <w:r>
+              <w:rPr>
+                <w:sz w:val="20"/>
+              </w:rPr>
+            </w:r>
+            <w:r>
+              <w:rPr>
+                <w:sz w:val="20"/>
+              </w:rPr>
+              <w:t>0.940</w:t>
+            </w:r>
+          </w:p>
+        </w:tc>
+        <w:tc>
+          <w:tcPr>
+            <w:tcW w:type="dxa" w:w="2160"/>
+          </w:tcPr>
+          <w:p>
+            <w:pPr>
+              <w:spacing w:after="40"/>
+              <w:jc w:val="right"/>
+            </w:pPr>
+            <w:r>
+              <w:rPr>
+                <w:sz w:val="20"/>
+              </w:rPr>
+            </w:r>
+            <w:r>
+              <w:rPr>
+                <w:sz w:val="20"/>
+              </w:rPr>
+              <w:t>0.926</w:t>
+            </w:r>
+          </w:p>
+        </w:tc>
+      </w:tr>
+      <w:tr>
+        <w:tc>
+          <w:tcPr>
+            <w:tcW w:type="dxa" w:w="3456"/>
+          </w:tcPr>
+          <w:p>
+            <w:pPr>
+              <w:spacing w:after="40"/>
+            </w:pPr>
+            <w:r>
+              <w:rPr>
+                <w:sz w:val="20"/>
+              </w:rPr>
+            </w:r>
+            <w:r>
+              <w:rPr>
+                <w:sz w:val="20"/>
+              </w:rPr>
+              <w:t>F1 — minor damage</w:t>
+            </w:r>
+          </w:p>
+        </w:tc>
+        <w:tc>
+          <w:tcPr>
+            <w:tcW w:type="dxa" w:w="1728"/>
+          </w:tcPr>
+          <w:p>
+            <w:pPr>
+              <w:spacing w:after="40"/>
+              <w:jc w:val="right"/>
+            </w:pPr>
+            <w:r>
+              <w:rPr>
+                <w:sz w:val="20"/>
+              </w:rPr>
+            </w:r>
+            <w:r>
+              <w:rPr>
+                <w:sz w:val="20"/>
+              </w:rPr>
+              <w:t>0.448</w:t>
+            </w:r>
+          </w:p>
+        </w:tc>
+        <w:tc>
+          <w:tcPr>
+            <w:tcW w:type="dxa" w:w="1728"/>
+          </w:tcPr>
+          <w:p>
+            <w:pPr>
+              <w:spacing w:after="40"/>
+              <w:jc w:val="right"/>
+            </w:pPr>
+            <w:r>
+              <w:rPr>
+                <w:sz w:val="20"/>
+              </w:rPr>
+            </w:r>
+            <w:r>
+              <w:rPr>
+                <w:sz w:val="20"/>
+              </w:rPr>
+              <w:t>0.231</w:t>
+            </w:r>
+          </w:p>
+        </w:tc>
+        <w:tc>
+          <w:tcPr>
+            <w:tcW w:type="dxa" w:w="2160"/>
+          </w:tcPr>
+          <w:p>
+            <w:pPr>
+              <w:spacing w:after="40"/>
+              <w:jc w:val="right"/>
+            </w:pPr>
+            <w:r>
+              <w:rPr>
+                <w:sz w:val="20"/>
+              </w:rPr>
+            </w:r>
+            <w:r>
+              <w:rPr>
+                <w:sz w:val="20"/>
+              </w:rPr>
+              <w:t>0.418</w:t>
+            </w:r>
+          </w:p>
+        </w:tc>
+      </w:tr>
+      <w:tr>
+        <w:tc>
+          <w:tcPr>
+            <w:tcW w:type="dxa" w:w="3456"/>
+          </w:tcPr>
+          <w:p>
+            <w:pPr>
+              <w:spacing w:after="40"/>
+            </w:pPr>
+            <w:r>
+              <w:rPr>
+                <w:sz w:val="20"/>
+              </w:rPr>
+            </w:r>
+            <w:r>
+              <w:rPr>
+                <w:sz w:val="20"/>
+              </w:rPr>
+              <w:t>F1 — major damage</w:t>
+            </w:r>
+          </w:p>
+        </w:tc>
+        <w:tc>
+          <w:tcPr>
+            <w:tcW w:type="dxa" w:w="1728"/>
+          </w:tcPr>
+          <w:p>
+            <w:pPr>
+              <w:spacing w:after="40"/>
+              <w:jc w:val="right"/>
+            </w:pPr>
+            <w:r>
+              <w:rPr>
+                <w:sz w:val="20"/>
+              </w:rPr>
+            </w:r>
+            <w:r>
+              <w:rPr>
+                <w:sz w:val="20"/>
+              </w:rPr>
+              <w:t>0.690</w:t>
+            </w:r>
+          </w:p>
+        </w:tc>
+        <w:tc>
+          <w:tcPr>
+            <w:tcW w:type="dxa" w:w="1728"/>
+          </w:tcPr>
+          <w:p>
+            <w:pPr>
+              <w:spacing w:after="40"/>
+              <w:jc w:val="right"/>
+            </w:pPr>
+            <w:r>
+              <w:rPr>
+                <w:sz w:val="20"/>
+              </w:rPr>
+            </w:r>
+            <w:r>
+              <w:rPr>
+                <w:sz w:val="20"/>
+              </w:rPr>
+              <w:t>0.610</w:t>
+            </w:r>
+          </w:p>
+        </w:tc>
+        <w:tc>
+          <w:tcPr>
+            <w:tcW w:type="dxa" w:w="2160"/>
+          </w:tcPr>
+          <w:p>
+            <w:pPr>
+              <w:spacing w:after="40"/>
+              <w:jc w:val="right"/>
+            </w:pPr>
+            <w:r>
+              <w:rPr>
+                <w:sz w:val="20"/>
+              </w:rPr>
+            </w:r>
+            <w:r>
+              <w:rPr>
+                <w:sz w:val="20"/>
+              </w:rPr>
+              <w:t>0.691</w:t>
+            </w:r>
+          </w:p>
+        </w:tc>
+      </w:tr>
+      <w:tr>
+        <w:tc>
+          <w:tcPr>
+            <w:tcW w:type="dxa" w:w="3456"/>
+          </w:tcPr>
+          <w:p>
+            <w:pPr>
+              <w:spacing w:after="40"/>
+            </w:pPr>
+            <w:r>
+              <w:rPr>
+                <w:sz w:val="20"/>
+              </w:rPr>
+            </w:r>
+            <w:r>
+              <w:rPr>
+                <w:sz w:val="20"/>
+              </w:rPr>
+              <w:t>F1 — destroyed</w:t>
+            </w:r>
+          </w:p>
+        </w:tc>
+        <w:tc>
+          <w:tcPr>
+            <w:tcW w:type="dxa" w:w="1728"/>
+          </w:tcPr>
+          <w:p>
+            <w:pPr>
+              <w:spacing w:after="40"/>
+              <w:jc w:val="right"/>
+            </w:pPr>
+            <w:r>
+              <w:rPr>
+                <w:sz w:val="20"/>
+              </w:rPr>
+            </w:r>
+            <w:r>
+              <w:rPr>
+                <w:sz w:val="20"/>
+              </w:rPr>
+              <w:t>0.801</w:t>
+            </w:r>
+          </w:p>
+        </w:tc>
+        <w:tc>
+          <w:tcPr>
+            <w:tcW w:type="dxa" w:w="1728"/>
+          </w:tcPr>
+          <w:p>
+            <w:pPr>
+              <w:spacing w:after="40"/>
+              <w:jc w:val="right"/>
+            </w:pPr>
+            <w:r>
+              <w:rPr>
+                <w:sz w:val="20"/>
+              </w:rPr>
+            </w:r>
+            <w:r>
+              <w:rPr>
+                <w:sz w:val="20"/>
+              </w:rPr>
+              <w:t>0.799</w:t>
+            </w:r>
+          </w:p>
+        </w:tc>
+        <w:tc>
+          <w:tcPr>
+            <w:tcW w:type="dxa" w:w="2160"/>
+          </w:tcPr>
+          <w:p>
+            <w:pPr>
+              <w:spacing w:after="40"/>
+              <w:jc w:val="right"/>
+            </w:pPr>
+            <w:r>
+              <w:rPr>
+                <w:sz w:val="20"/>
+              </w:rPr>
+            </w:r>
+            <w:r>
+              <w:rPr>
+                <w:sz w:val="20"/>
+              </w:rPr>
+              <w:t>0.815</w:t>
+            </w:r>
+          </w:p>
+        </w:tc>
+      </w:tr>
+      <w:tr>
+        <w:tc>
+          <w:tcPr>
+            <w:tcW w:type="dxa" w:w="3456"/>
+          </w:tcPr>
+          <w:p>
+            <w:pPr>
+              <w:spacing w:after="40"/>
+            </w:pPr>
+            <w:r>
+              <w:rPr>
+                <w:sz w:val="20"/>
+              </w:rPr>
+            </w:r>
+            <w:r>
+              <w:rPr>
+                <w:sz w:val="20"/>
+              </w:rPr>
+              <w:t>Building-level accuracy</w:t>
+            </w:r>
+          </w:p>
+        </w:tc>
+        <w:tc>
+          <w:tcPr>
+            <w:tcW w:type="dxa" w:w="1728"/>
+          </w:tcPr>
+          <w:p>
+            <w:pPr>
+              <w:spacing w:after="40"/>
+              <w:jc w:val="right"/>
+            </w:pPr>
+            <w:r>
+              <w:rPr>
+                <w:sz w:val="20"/>
+              </w:rPr>
+            </w:r>
+            <w:r>
+              <w:rPr>
+                <w:sz w:val="20"/>
+              </w:rPr>
+              <w:t>77.7%</w:t>
+            </w:r>
+          </w:p>
+        </w:tc>
+        <w:tc>
+          <w:tcPr>
+            <w:tcW w:type="dxa" w:w="1728"/>
+          </w:tcPr>
+          <w:p>
+            <w:pPr>
+              <w:spacing w:after="40"/>
+              <w:jc w:val="right"/>
+            </w:pPr>
+            <w:r>
+              <w:rPr>
+                <w:sz w:val="20"/>
+              </w:rPr>
+            </w:r>
+            <w:r>
+              <w:rPr>
+                <w:sz w:val="20"/>
+              </w:rPr>
+              <w:t>81.5%</w:t>
+            </w:r>
+          </w:p>
+        </w:tc>
+        <w:tc>
+          <w:tcPr>
+            <w:tcW w:type="dxa" w:w="2160"/>
+          </w:tcPr>
+          <w:p>
+            <w:pPr>
+              <w:spacing w:after="40"/>
+              <w:jc w:val="right"/>
+            </w:pPr>
+            <w:r>
+              <w:rPr>
+                <w:sz w:val="20"/>
+              </w:rPr>
+            </w:r>
+            <w:r>
+              <w:rPr>
+                <w:sz w:val="20"/>
+              </w:rPr>
+              <w:t>80.8%</w:t>
+            </w:r>
+          </w:p>
+        </w:tc>
+      </w:tr>
+    </w:tbl>
+    <w:p/>
+    <w:p>
+      <w:pPr>
+        <w:keepNext/>
+        <w:jc w:val="center"/>
+      </w:pPr>
+      <w:r>
+        <w:rPr>
+          <w:b/>
+          <w:sz w:val="19"/>
+        </w:rPr>
+        <w:t xml:space="preserve">Table 12. </w:t>
+      </w:r>
+      <w:r>
+        <w:rPr>
+          <w:i/>
+          <w:color w:val="555F6D"/>
+          <w:sz w:val="19"/>
+        </w:rPr>
+        <w:t>Localization model on the hold and test splits.</w:t>
       </w:r>
     </w:p>
     <w:tbl>
@@ -6958,7 +7284,7 @@
       <w:tr>
         <w:tc>
           <w:tcPr>
-            <w:tcW w:type="dxa" w:w="2304"/>
+            <w:tcW w:type="dxa" w:w="2880"/>
             <w:shd w:val="clear" w:color="auto" w:fill="DCE6F2"/>
           </w:tcPr>
           <w:p>
@@ -6971,13 +7297,13 @@
                 <w:b/>
                 <w:sz w:val="20"/>
               </w:rPr>
-              <w:t>Step</w:t>
-            </w:r>
-          </w:p>
-        </w:tc>
-        <w:tc>
-          <w:tcPr>
-            <w:tcW w:type="dxa" w:w="5616"/>
+              <w:t>Metric</w:t>
+            </w:r>
+          </w:p>
+        </w:tc>
+        <w:tc>
+          <w:tcPr>
+            <w:tcW w:type="dxa" w:w="1728"/>
             <w:shd w:val="clear" w:color="auto" w:fill="DCE6F2"/>
           </w:tcPr>
           <w:p>
@@ -6990,13 +7316,13 @@
                 <w:b/>
                 <w:sz w:val="20"/>
               </w:rPr>
-              <w:t>Command</w:t>
-            </w:r>
-          </w:p>
-        </w:tc>
-        <w:tc>
-          <w:tcPr>
-            <w:tcW w:type="dxa" w:w="1296"/>
+              <w:t>Hold</w:t>
+            </w:r>
+          </w:p>
+        </w:tc>
+        <w:tc>
+          <w:tcPr>
+            <w:tcW w:type="dxa" w:w="1728"/>
             <w:shd w:val="clear" w:color="auto" w:fill="DCE6F2"/>
           </w:tcPr>
           <w:p>
@@ -7009,7 +7335,7 @@
                 <w:b/>
                 <w:sz w:val="20"/>
               </w:rPr>
-              <w:t>Time</w:t>
+              <w:t>Test</w:t>
             </w:r>
           </w:p>
         </w:tc>
@@ -7017,65 +7343,66 @@
       <w:tr>
         <w:tc>
           <w:tcPr>
-            <w:tcW w:type="dxa" w:w="2304"/>
-          </w:tcPr>
-          <w:p>
-            <w:pPr>
-              <w:spacing w:after="40"/>
-            </w:pPr>
-            <w:r>
-              <w:rPr>
-                <w:sz w:val="20"/>
-              </w:rPr>
-            </w:r>
-            <w:r>
-              <w:rPr>
-                <w:sz w:val="20"/>
-              </w:rPr>
-              <w:t>1. Install libraries</w:t>
-            </w:r>
-          </w:p>
-        </w:tc>
-        <w:tc>
-          <w:tcPr>
-            <w:tcW w:type="dxa" w:w="5616"/>
-          </w:tcPr>
-          <w:p>
-            <w:pPr>
-              <w:spacing w:after="40"/>
-            </w:pPr>
-            <w:r>
-              <w:rPr>
-                <w:sz w:val="20"/>
-              </w:rPr>
-            </w:r>
-            <w:r>
-              <w:rPr>
-                <w:rFonts w:ascii="Consolas" w:hAnsi="Consolas"/>
-                <w:sz w:val="20"/>
-              </w:rPr>
-              <w:t>python -m pip install -r requirements.txt</w:t>
-            </w:r>
-          </w:p>
-        </w:tc>
-        <w:tc>
-          <w:tcPr>
-            <w:tcW w:type="dxa" w:w="1296"/>
-          </w:tcPr>
-          <w:p>
-            <w:pPr>
-              <w:spacing w:after="40"/>
-            </w:pPr>
-            <w:r>
-              <w:rPr>
-                <w:sz w:val="20"/>
-              </w:rPr>
-            </w:r>
-            <w:r>
-              <w:rPr>
-                <w:sz w:val="20"/>
-              </w:rPr>
-              <w:t>minutes</w:t>
+            <w:tcW w:type="dxa" w:w="2880"/>
+          </w:tcPr>
+          <w:p>
+            <w:pPr>
+              <w:spacing w:after="40"/>
+            </w:pPr>
+            <w:r>
+              <w:rPr>
+                <w:sz w:val="20"/>
+              </w:rPr>
+            </w:r>
+            <w:r>
+              <w:rPr>
+                <w:sz w:val="20"/>
+              </w:rPr>
+              <w:t>Pixel F1</w:t>
+            </w:r>
+          </w:p>
+        </w:tc>
+        <w:tc>
+          <w:tcPr>
+            <w:tcW w:type="dxa" w:w="1728"/>
+          </w:tcPr>
+          <w:p>
+            <w:pPr>
+              <w:spacing w:after="40"/>
+              <w:jc w:val="right"/>
+            </w:pPr>
+            <w:r>
+              <w:rPr>
+                <w:sz w:val="20"/>
+              </w:rPr>
+            </w:r>
+            <w:r>
+              <w:rPr>
+                <w:sz w:val="20"/>
+              </w:rPr>
+              <w:t>0.792</w:t>
+            </w:r>
+          </w:p>
+        </w:tc>
+        <w:tc>
+          <w:tcPr>
+            <w:tcW w:type="dxa" w:w="1728"/>
+          </w:tcPr>
+          <w:p>
+            <w:pPr>
+              <w:spacing w:after="40"/>
+              <w:jc w:val="right"/>
+            </w:pPr>
+            <w:r>
+              <w:rPr>
+                <w:sz w:val="20"/>
+              </w:rPr>
+            </w:r>
+            <w:r>
+              <w:rPr>
+                <w:sz w:val="20"/>
+              </w:rPr>
+              <w:t>0.788</w:t>
             </w:r>
           </w:p>
         </w:tc>
@@ -7083,65 +7410,66 @@
       <w:tr>
         <w:tc>
           <w:tcPr>
-            <w:tcW w:type="dxa" w:w="2304"/>
-          </w:tcPr>
-          <w:p>
-            <w:pPr>
-              <w:spacing w:after="40"/>
-            </w:pPr>
-            <w:r>
-              <w:rPr>
-                <w:sz w:val="20"/>
-              </w:rPr>
-            </w:r>
-            <w:r>
-              <w:rPr>
-                <w:sz w:val="20"/>
-              </w:rPr>
-              <w:t>2. Convert the data</w:t>
-            </w:r>
-          </w:p>
-        </w:tc>
-        <w:tc>
-          <w:tcPr>
-            <w:tcW w:type="dxa" w:w="5616"/>
-          </w:tcPr>
-          <w:p>
-            <w:pPr>
-              <w:spacing w:after="40"/>
-            </w:pPr>
-            <w:r>
-              <w:rPr>
-                <w:sz w:val="20"/>
-              </w:rPr>
-            </w:r>
-            <w:r>
-              <w:rPr>
-                <w:rFonts w:ascii="Consolas" w:hAnsi="Consolas"/>
-                <w:sz w:val="20"/>
-              </w:rPr>
-              <w:t>python -m src.preprocess</w:t>
-            </w:r>
-          </w:p>
-        </w:tc>
-        <w:tc>
-          <w:tcPr>
-            <w:tcW w:type="dxa" w:w="1296"/>
-          </w:tcPr>
-          <w:p>
-            <w:pPr>
-              <w:spacing w:after="40"/>
-            </w:pPr>
-            <w:r>
-              <w:rPr>
-                <w:sz w:val="20"/>
-              </w:rPr>
-            </w:r>
-            <w:r>
-              <w:rPr>
-                <w:sz w:val="20"/>
-              </w:rPr>
-              <w:t>~5 min</w:t>
+            <w:tcW w:type="dxa" w:w="2880"/>
+          </w:tcPr>
+          <w:p>
+            <w:pPr>
+              <w:spacing w:after="40"/>
+            </w:pPr>
+            <w:r>
+              <w:rPr>
+                <w:sz w:val="20"/>
+              </w:rPr>
+            </w:r>
+            <w:r>
+              <w:rPr>
+                <w:sz w:val="20"/>
+              </w:rPr>
+              <w:t>Precision</w:t>
+            </w:r>
+          </w:p>
+        </w:tc>
+        <w:tc>
+          <w:tcPr>
+            <w:tcW w:type="dxa" w:w="1728"/>
+          </w:tcPr>
+          <w:p>
+            <w:pPr>
+              <w:spacing w:after="40"/>
+              <w:jc w:val="right"/>
+            </w:pPr>
+            <w:r>
+              <w:rPr>
+                <w:sz w:val="20"/>
+              </w:rPr>
+            </w:r>
+            <w:r>
+              <w:rPr>
+                <w:sz w:val="20"/>
+              </w:rPr>
+              <w:t>0.818</w:t>
+            </w:r>
+          </w:p>
+        </w:tc>
+        <w:tc>
+          <w:tcPr>
+            <w:tcW w:type="dxa" w:w="1728"/>
+          </w:tcPr>
+          <w:p>
+            <w:pPr>
+              <w:spacing w:after="40"/>
+              <w:jc w:val="right"/>
+            </w:pPr>
+            <w:r>
+              <w:rPr>
+                <w:sz w:val="20"/>
+              </w:rPr>
+            </w:r>
+            <w:r>
+              <w:rPr>
+                <w:sz w:val="20"/>
+              </w:rPr>
+              <w:t>0.811</w:t>
             </w:r>
           </w:p>
         </w:tc>
@@ -7149,467 +7477,66 @@
       <w:tr>
         <w:tc>
           <w:tcPr>
-            <w:tcW w:type="dxa" w:w="2304"/>
-          </w:tcPr>
-          <w:p>
-            <w:pPr>
-              <w:spacing w:after="40"/>
-            </w:pPr>
-            <w:r>
-              <w:rPr>
-                <w:sz w:val="20"/>
-              </w:rPr>
-            </w:r>
-            <w:r>
-              <w:rPr>
-                <w:sz w:val="20"/>
-              </w:rPr>
-              <w:t>3. Train localization</w:t>
-            </w:r>
-          </w:p>
-        </w:tc>
-        <w:tc>
-          <w:tcPr>
-            <w:tcW w:type="dxa" w:w="5616"/>
-          </w:tcPr>
-          <w:p>
-            <w:pPr>
-              <w:spacing w:after="40"/>
-            </w:pPr>
-            <w:r>
-              <w:rPr>
-                <w:sz w:val="20"/>
-              </w:rPr>
-            </w:r>
-            <w:r>
-              <w:rPr>
-                <w:rFonts w:ascii="Consolas" w:hAnsi="Consolas"/>
-                <w:sz w:val="20"/>
-              </w:rPr>
-              <w:t>python -m src.train --epochs 30</w:t>
-            </w:r>
-          </w:p>
-        </w:tc>
-        <w:tc>
-          <w:tcPr>
-            <w:tcW w:type="dxa" w:w="1296"/>
-          </w:tcPr>
-          <w:p>
-            <w:pPr>
-              <w:spacing w:after="40"/>
-            </w:pPr>
-            <w:r>
-              <w:rPr>
-                <w:sz w:val="20"/>
-              </w:rPr>
-            </w:r>
-            <w:r>
-              <w:rPr>
-                <w:sz w:val="20"/>
-              </w:rPr>
-              <w:t>~3.5 h</w:t>
-            </w:r>
-          </w:p>
-        </w:tc>
-      </w:tr>
-      <w:tr>
-        <w:tc>
-          <w:tcPr>
-            <w:tcW w:type="dxa" w:w="2304"/>
-          </w:tcPr>
-          <w:p>
-            <w:pPr>
-              <w:spacing w:after="40"/>
-            </w:pPr>
-            <w:r>
-              <w:rPr>
-                <w:sz w:val="20"/>
-              </w:rPr>
-            </w:r>
-            <w:r>
-              <w:rPr>
-                <w:sz w:val="20"/>
-              </w:rPr>
-              <w:t>4. Train damage model (v1)</w:t>
-            </w:r>
-          </w:p>
-        </w:tc>
-        <w:tc>
-          <w:tcPr>
-            <w:tcW w:type="dxa" w:w="5616"/>
-          </w:tcPr>
-          <w:p>
-            <w:pPr>
-              <w:spacing w:after="40"/>
-            </w:pPr>
-            <w:r>
-              <w:rPr>
-                <w:sz w:val="20"/>
-              </w:rPr>
-            </w:r>
-            <w:r>
-              <w:rPr>
-                <w:rFonts w:ascii="Consolas" w:hAnsi="Consolas"/>
-                <w:sz w:val="20"/>
-              </w:rPr>
-              <w:t>python -m src.damage --epochs 30</w:t>
-            </w:r>
-          </w:p>
-        </w:tc>
-        <w:tc>
-          <w:tcPr>
-            <w:tcW w:type="dxa" w:w="1296"/>
-          </w:tcPr>
-          <w:p>
-            <w:pPr>
-              <w:spacing w:after="40"/>
-            </w:pPr>
-            <w:r>
-              <w:rPr>
-                <w:sz w:val="20"/>
-              </w:rPr>
-            </w:r>
-            <w:r>
-              <w:rPr>
-                <w:sz w:val="20"/>
-              </w:rPr>
-              <w:t>~3.5 h</w:t>
-            </w:r>
-          </w:p>
-        </w:tc>
-      </w:tr>
-      <w:tr>
-        <w:tc>
-          <w:tcPr>
-            <w:tcW w:type="dxa" w:w="2304"/>
-          </w:tcPr>
-          <w:p>
-            <w:pPr>
-              <w:spacing w:after="40"/>
-            </w:pPr>
-            <w:r>
-              <w:rPr>
-                <w:sz w:val="20"/>
-              </w:rPr>
-            </w:r>
-            <w:r>
-              <w:rPr>
-                <w:sz w:val="20"/>
-              </w:rPr>
-              <w:t>4b. Fine-tune (v3)</w:t>
-            </w:r>
-          </w:p>
-        </w:tc>
-        <w:tc>
-          <w:tcPr>
-            <w:tcW w:type="dxa" w:w="5616"/>
-          </w:tcPr>
-          <w:p>
-            <w:pPr>
-              <w:spacing w:after="40"/>
-            </w:pPr>
-            <w:r>
-              <w:rPr>
-                <w:sz w:val="20"/>
-              </w:rPr>
-            </w:r>
-            <w:r>
-              <w:rPr>
-                <w:rFonts w:ascii="Consolas" w:hAnsi="Consolas"/>
-                <w:sz w:val="20"/>
-              </w:rPr>
-              <w:t>python -m src.damage --out-dir runs/damage_v3 --train-splits tier1 tier3 --epochs 10 --lr 1e-4 --init-from runs/damage_resnet34/best.pt --class-weights 0.5 1 4 4 3</w:t>
-            </w:r>
-          </w:p>
-        </w:tc>
-        <w:tc>
-          <w:tcPr>
-            <w:tcW w:type="dxa" w:w="1296"/>
-          </w:tcPr>
-          <w:p>
-            <w:pPr>
-              <w:spacing w:after="40"/>
-            </w:pPr>
-            <w:r>
-              <w:rPr>
-                <w:sz w:val="20"/>
-              </w:rPr>
-            </w:r>
-            <w:r>
-              <w:rPr>
-                <w:sz w:val="20"/>
-              </w:rPr>
-              <w:t>~3.3 h</w:t>
-            </w:r>
-          </w:p>
-        </w:tc>
-      </w:tr>
-      <w:tr>
-        <w:tc>
-          <w:tcPr>
-            <w:tcW w:type="dxa" w:w="2304"/>
-          </w:tcPr>
-          <w:p>
-            <w:pPr>
-              <w:spacing w:after="40"/>
-            </w:pPr>
-            <w:r>
-              <w:rPr>
-                <w:sz w:val="20"/>
-              </w:rPr>
-            </w:r>
-            <w:r>
-              <w:rPr>
-                <w:sz w:val="20"/>
-              </w:rPr>
-              <w:t>5. Watch training</w:t>
-            </w:r>
-          </w:p>
-        </w:tc>
-        <w:tc>
-          <w:tcPr>
-            <w:tcW w:type="dxa" w:w="5616"/>
-          </w:tcPr>
-          <w:p>
-            <w:pPr>
-              <w:spacing w:after="40"/>
-            </w:pPr>
-            <w:r>
-              <w:rPr>
-                <w:sz w:val="20"/>
-              </w:rPr>
-            </w:r>
-            <w:r>
-              <w:rPr>
-                <w:rFonts w:ascii="Consolas" w:hAnsi="Consolas"/>
-                <w:sz w:val="20"/>
-              </w:rPr>
-              <w:t>python -m src.progress</w:t>
-            </w:r>
-          </w:p>
-        </w:tc>
-        <w:tc>
-          <w:tcPr>
-            <w:tcW w:type="dxa" w:w="1296"/>
-          </w:tcPr>
-          <w:p>
-            <w:pPr>
-              <w:spacing w:after="40"/>
-            </w:pPr>
-            <w:r>
-              <w:rPr>
-                <w:sz w:val="20"/>
-              </w:rPr>
-            </w:r>
-            <w:r>
-              <w:rPr>
-                <w:sz w:val="20"/>
-              </w:rPr>
-              <w:t>—</w:t>
-            </w:r>
-          </w:p>
-        </w:tc>
-      </w:tr>
-      <w:tr>
-        <w:tc>
-          <w:tcPr>
-            <w:tcW w:type="dxa" w:w="2304"/>
-          </w:tcPr>
-          <w:p>
-            <w:pPr>
-              <w:spacing w:after="40"/>
-            </w:pPr>
-            <w:r>
-              <w:rPr>
-                <w:sz w:val="20"/>
-              </w:rPr>
-            </w:r>
-            <w:r>
-              <w:rPr>
-                <w:sz w:val="20"/>
-              </w:rPr>
-              <w:t>6. Export map data</w:t>
-            </w:r>
-          </w:p>
-        </w:tc>
-        <w:tc>
-          <w:tcPr>
-            <w:tcW w:type="dxa" w:w="5616"/>
-          </w:tcPr>
-          <w:p>
-            <w:pPr>
-              <w:spacing w:after="40"/>
-            </w:pPr>
-            <w:r>
-              <w:rPr>
-                <w:sz w:val="20"/>
-              </w:rPr>
-            </w:r>
-            <w:r>
-              <w:rPr>
-                <w:rFonts w:ascii="Consolas" w:hAnsi="Consolas"/>
-                <w:sz w:val="20"/>
-              </w:rPr>
-              <w:t>python -m src.predict</w:t>
-            </w:r>
-          </w:p>
-        </w:tc>
-        <w:tc>
-          <w:tcPr>
-            <w:tcW w:type="dxa" w:w="1296"/>
-          </w:tcPr>
-          <w:p>
-            <w:pPr>
-              <w:spacing w:after="40"/>
-            </w:pPr>
-            <w:r>
-              <w:rPr>
-                <w:sz w:val="20"/>
-              </w:rPr>
-            </w:r>
-            <w:r>
-              <w:rPr>
-                <w:sz w:val="20"/>
-              </w:rPr>
-              <w:t>~25 min</w:t>
-            </w:r>
-          </w:p>
-        </w:tc>
-      </w:tr>
-      <w:tr>
-        <w:tc>
-          <w:tcPr>
-            <w:tcW w:type="dxa" w:w="2304"/>
-          </w:tcPr>
-          <w:p>
-            <w:pPr>
-              <w:spacing w:after="40"/>
-            </w:pPr>
-            <w:r>
-              <w:rPr>
-                <w:sz w:val="20"/>
-              </w:rPr>
-            </w:r>
-            <w:r>
-              <w:rPr>
-                <w:sz w:val="20"/>
-              </w:rPr>
-              <w:t>7. Open the dashboard</w:t>
-            </w:r>
-          </w:p>
-        </w:tc>
-        <w:tc>
-          <w:tcPr>
-            <w:tcW w:type="dxa" w:w="5616"/>
-          </w:tcPr>
-          <w:p>
-            <w:pPr>
-              <w:spacing w:after="40"/>
-            </w:pPr>
-            <w:r>
-              <w:rPr>
-                <w:sz w:val="20"/>
-              </w:rPr>
-            </w:r>
-            <w:r>
-              <w:rPr>
-                <w:rFonts w:ascii="Consolas" w:hAnsi="Consolas"/>
-                <w:sz w:val="20"/>
-              </w:rPr>
-              <w:t>python -m http.server 8000 -d dashboard</w:t>
-            </w:r>
-            <w:r>
-              <w:rPr>
-                <w:sz w:val="20"/>
-              </w:rPr>
-              <w:t>, then visit localhost:8000</w:t>
-            </w:r>
-          </w:p>
-        </w:tc>
-        <w:tc>
-          <w:tcPr>
-            <w:tcW w:type="dxa" w:w="1296"/>
-          </w:tcPr>
-          <w:p>
-            <w:pPr>
-              <w:spacing w:after="40"/>
-            </w:pPr>
-            <w:r>
-              <w:rPr>
-                <w:sz w:val="20"/>
-              </w:rPr>
-            </w:r>
-            <w:r>
-              <w:rPr>
-                <w:sz w:val="20"/>
-              </w:rPr>
-              <w:t>—</w:t>
-            </w:r>
-          </w:p>
-        </w:tc>
-      </w:tr>
-      <w:tr>
-        <w:tc>
-          <w:tcPr>
-            <w:tcW w:type="dxa" w:w="2304"/>
-          </w:tcPr>
-          <w:p>
-            <w:pPr>
-              <w:spacing w:after="40"/>
-            </w:pPr>
-            <w:r>
-              <w:rPr>
-                <w:sz w:val="20"/>
-              </w:rPr>
-            </w:r>
-            <w:r>
-              <w:rPr>
-                <w:sz w:val="20"/>
-              </w:rPr>
-              <w:t>8. Rebuild this report</w:t>
-            </w:r>
-          </w:p>
-        </w:tc>
-        <w:tc>
-          <w:tcPr>
-            <w:tcW w:type="dxa" w:w="5616"/>
-          </w:tcPr>
-          <w:p>
-            <w:pPr>
-              <w:spacing w:after="40"/>
-            </w:pPr>
-            <w:r>
-              <w:rPr>
-                <w:sz w:val="20"/>
-              </w:rPr>
-            </w:r>
-            <w:r>
-              <w:rPr>
-                <w:rFonts w:ascii="Consolas" w:hAnsi="Consolas"/>
-                <w:sz w:val="20"/>
-              </w:rPr>
-              <w:t>python docs/build_report.py</w:t>
-            </w:r>
-          </w:p>
-        </w:tc>
-        <w:tc>
-          <w:tcPr>
-            <w:tcW w:type="dxa" w:w="1296"/>
-          </w:tcPr>
-          <w:p>
-            <w:pPr>
-              <w:spacing w:after="40"/>
-            </w:pPr>
-            <w:r>
-              <w:rPr>
-                <w:sz w:val="20"/>
-              </w:rPr>
-            </w:r>
-            <w:r>
-              <w:rPr>
-                <w:sz w:val="20"/>
-              </w:rPr>
-              <w:t>seconds</w:t>
+            <w:tcW w:type="dxa" w:w="2880"/>
+          </w:tcPr>
+          <w:p>
+            <w:pPr>
+              <w:spacing w:after="40"/>
+            </w:pPr>
+            <w:r>
+              <w:rPr>
+                <w:sz w:val="20"/>
+              </w:rPr>
+            </w:r>
+            <w:r>
+              <w:rPr>
+                <w:sz w:val="20"/>
+              </w:rPr>
+              <w:t>Recall</w:t>
+            </w:r>
+          </w:p>
+        </w:tc>
+        <w:tc>
+          <w:tcPr>
+            <w:tcW w:type="dxa" w:w="1728"/>
+          </w:tcPr>
+          <w:p>
+            <w:pPr>
+              <w:spacing w:after="40"/>
+              <w:jc w:val="right"/>
+            </w:pPr>
+            <w:r>
+              <w:rPr>
+                <w:sz w:val="20"/>
+              </w:rPr>
+            </w:r>
+            <w:r>
+              <w:rPr>
+                <w:sz w:val="20"/>
+              </w:rPr>
+              <w:t>0.767</w:t>
+            </w:r>
+          </w:p>
+        </w:tc>
+        <w:tc>
+          <w:tcPr>
+            <w:tcW w:type="dxa" w:w="1728"/>
+          </w:tcPr>
+          <w:p>
+            <w:pPr>
+              <w:spacing w:after="40"/>
+              <w:jc w:val="right"/>
+            </w:pPr>
+            <w:r>
+              <w:rPr>
+                <w:sz w:val="20"/>
+              </w:rPr>
+            </w:r>
+            <w:r>
+              <w:rPr>
+                <w:sz w:val="20"/>
+              </w:rPr>
+              <w:t>0.767</w:t>
             </w:r>
           </w:p>
         </w:tc>
@@ -7617,11 +7544,572 @@
     </w:tbl>
     <w:p/>
     <w:p>
+      <w:r>
+        <w:t xml:space="preserve">On the test split the final model reaches a score of </w:t>
+      </w:r>
+      <w:r>
+        <w:rPr>
+          <w:b/>
+        </w:rPr>
+        <w:t>0.702</w:t>
+      </w:r>
+      <w:r>
+        <w:t xml:space="preserve"> (−0.009 compared with hold) and assigns the correct damage level to </w:t>
+      </w:r>
+      <w:r>
+        <w:rPr>
+          <w:b/>
+        </w:rPr>
+        <w:t>80.8%</w:t>
+      </w:r>
+      <w:r>
+        <w:t xml:space="preserve"> of buildings. The improvement from v1 to v3 holds on unseen data (0.584 → 0.702). These test-split figures are the project's reported results.</w:t>
+      </w:r>
+    </w:p>
+    <w:p>
+      <w:r>
+        <w:rPr>
+          <w:highlight w:val="yellow"/>
+        </w:rPr>
+        <w:t>Add one or two sentences of your own interpretation of the test results here.</w:t>
+      </w:r>
+    </w:p>
+    <w:p>
+      <w:pPr>
+        <w:pStyle w:val="Heading1"/>
+      </w:pPr>
+      <w:r>
+        <w:t>9. Discussion and Limitations</w:t>
+      </w:r>
+    </w:p>
+    <w:p>
+      <w:pPr>
+        <w:pStyle w:val="ListBullet"/>
+      </w:pPr>
+      <w:r>
+        <w:rPr>
+          <w:b/>
+        </w:rPr>
+        <w:t>Minor damage is hard to see.</w:t>
+      </w:r>
+      <w:r>
+        <w:t xml:space="preserve"> At about 0.5 m per pixel, the difference between no, minor and major damage is often a few pixels. Even human labellers disagree most on this level.</w:t>
+      </w:r>
+    </w:p>
+    <w:p>
+      <w:pPr>
+        <w:pStyle w:val="ListBullet"/>
+      </w:pPr>
+      <w:r>
+        <w:rPr>
+          <w:b/>
+        </w:rPr>
+        <w:t>Touching buildings are merged.</w:t>
+      </w:r>
+      <w:r>
+        <w:t xml:space="preserve"> Buildings are separated by finding connected regions, so adjacent houses become one predicted building. Top xView2 solutions split them with additional steps such as watershed segmentation.</w:t>
+      </w:r>
+    </w:p>
+    <w:p>
+      <w:pPr>
+        <w:pStyle w:val="ListBullet"/>
+      </w:pPr>
+      <w:r>
+        <w:rPr>
+          <w:b/>
+        </w:rPr>
+        <w:t>Domain shift.</w:t>
+      </w:r>
+      <w:r>
+        <w:t xml:space="preserve"> The training data is mostly US suburbs; performance drops on very different settlements (Haiti).</w:t>
+      </w:r>
+    </w:p>
+    <w:p>
+      <w:pPr>
+        <w:pStyle w:val="ListBullet"/>
+      </w:pPr>
+      <w:r>
+        <w:rPr>
+          <w:b/>
+        </w:rPr>
+        <w:t>Validation-based model choices.</w:t>
+      </w:r>
+      <w:r>
+        <w:t xml:space="preserve"> Epochs and model versions were chosen on the hold split; only Section 8 uses the untouched test split.</w:t>
+      </w:r>
+    </w:p>
+    <w:p>
+      <w:pPr>
+        <w:pStyle w:val="ListBullet"/>
+      </w:pPr>
+      <w:r>
+        <w:rPr>
+          <w:b/>
+        </w:rPr>
+        <w:t>Single runs and combined changes.</w:t>
+      </w:r>
+      <w:r>
+        <w:t xml:space="preserve"> Each configuration was trained once, so differences of a few points may partly be run-to-run noise. v3 changed several things at once (starting point, data, weights, learning rate), so its improvement cannot be attributed to any single change.</w:t>
+      </w:r>
+    </w:p>
+    <w:p>
+      <w:pPr>
+        <w:pStyle w:val="ListBullet"/>
+      </w:pPr>
+      <w:r>
+        <w:rPr>
+          <w:b/>
+        </w:rPr>
+        <w:t>Simple architecture.</w:t>
+      </w:r>
+      <w:r>
+        <w:t xml:space="preserve"> A 6-channel U-Net is simpler than the Siamese networks and ensembles used by top solutions.</w:t>
+      </w:r>
+    </w:p>
+    <w:p>
+      <w:pPr>
+        <w:pStyle w:val="Heading1"/>
+      </w:pPr>
+      <w:r>
+        <w:t>10. Conclusion and Future Work</w:t>
+      </w:r>
+    </w:p>
+    <w:p>
+      <w:r>
+        <w:t>This project delivered a complete, working system for building damage assessment after hurricanes: from raw satellite data, through two trained models, to an interactive map. Trained on a single laptop, it finds buildings with a pixel F1 of 0.792, reaches a damage score of 0.711 and assigns the correct damage level to 77.7% of buildings. Minor damage remains the hardest level, but fine-tuning with balanced weights and more data roughly doubled its F1. Along the way the project identified and corrected a georeferencing error in the dataset's GeoTIFF metadata.</w:t>
+      </w:r>
+    </w:p>
+    <w:p>
+      <w:r>
+        <w:t>Future work, roughly in order of expected benefit:</w:t>
+      </w:r>
+    </w:p>
+    <w:p>
+      <w:pPr>
+        <w:pStyle w:val="ListBullet"/>
+      </w:pPr>
+      <w:r>
+        <w:t>A Siamese architecture that processes before and after images with a shared encoder.</w:t>
+      </w:r>
+    </w:p>
+    <w:p>
+      <w:pPr>
+        <w:pStyle w:val="ListBullet"/>
+      </w:pPr>
+      <w:r>
+        <w:t>Separating touching buildings (for example with watershed segmentation).</w:t>
+      </w:r>
+    </w:p>
+    <w:p>
+      <w:pPr>
+        <w:pStyle w:val="ListBullet"/>
+      </w:pPr>
+      <w:r>
+        <w:t>Ensembles and test-time augmentation (averaging predictions over flipped and rotated inputs).</w:t>
+      </w:r>
+    </w:p>
+    <w:p>
+      <w:pPr>
+        <w:pStyle w:val="ListBullet"/>
+      </w:pPr>
+      <w:r>
+        <w:t>Fine-tuning on data from the region of interest to reduce domain shift.</w:t>
+      </w:r>
+    </w:p>
+    <w:p>
+      <w:pPr>
+        <w:pStyle w:val="Heading1"/>
+      </w:pPr>
+      <w:r>
+        <w:t>References</w:t>
+      </w:r>
+    </w:p>
+    <w:p>
+      <w:r>
+        <w:t>Gupta, R., Goodman, B., Patel, N., Hosfelt, R., Sajeev, S., Heim, E., Doshi, J., Lucas, K., Choset, H., &amp; Gaston, M. (2019). Creating xBD: A dataset for assessing building damage from satellite imagery. CVPR Workshops.</w:t>
+      </w:r>
+    </w:p>
+    <w:p>
+      <w:r>
+        <w:t>Ronneberger, O., Fischer, P., &amp; Brox, T. (2015). U-Net: Convolutional networks for biomedical image segmentation. MICCAI.</w:t>
+      </w:r>
+    </w:p>
+    <w:p>
+      <w:r>
+        <w:t>He, K., Zhang, X., Ren, S., &amp; Sun, J. (2016). Deep residual learning for image recognition. CVPR.</w:t>
+      </w:r>
+    </w:p>
+    <w:p>
+      <w:r>
+        <w:t>Iakubovskii, P. (2019). Segmentation Models PyTorch. GitHub repository, qubvel/segmentation_models.pytorch.</w:t>
+      </w:r>
+    </w:p>
+    <w:p>
+      <w:r>
+        <w:t>xView2 challenge: Computer vision for building damage assessment. https://xview2.org</w:t>
+      </w:r>
+    </w:p>
+    <w:p>
+      <w:r>
+        <w:br w:type="page"/>
+      </w:r>
+    </w:p>
+    <w:p>
+      <w:pPr>
+        <w:pStyle w:val="Heading1"/>
+      </w:pPr>
+      <w:r>
+        <w:t>Part B — Code Walkthrough</w:t>
+      </w:r>
+    </w:p>
+    <w:p>
+      <w:r>
+        <w:t>This part explains how the code is organized and what each file does, with the most important functions shown in full. Code excerpts are copied automatically from the source files when this report is built.</w:t>
+      </w:r>
+    </w:p>
+    <w:p>
       <w:pPr>
         <w:pStyle w:val="Heading2"/>
       </w:pPr>
       <w:r>
-        <w:t>B.3 How data flows between files</w:t>
+        <w:t>B.1 Project structure</w:t>
+      </w:r>
+    </w:p>
+    <w:p>
+      <w:pPr>
+        <w:spacing w:after="0" w:line="240" w:lineRule="auto"/>
+        <w:shd w:val="clear" w:color="auto" w:fill="F3F4F6"/>
+      </w:pPr>
+      <w:r>
+        <w:rPr>
+          <w:rFonts w:ascii="Consolas" w:hAnsi="Consolas"/>
+          <w:sz w:val="17"/>
+        </w:rPr>
+        <w:t>fyp/</w:t>
+      </w:r>
+    </w:p>
+    <w:p>
+      <w:pPr>
+        <w:spacing w:after="0" w:line="240" w:lineRule="auto"/>
+        <w:shd w:val="clear" w:color="auto" w:fill="F3F4F6"/>
+      </w:pPr>
+      <w:r>
+        <w:rPr>
+          <w:rFonts w:ascii="Consolas" w:hAnsi="Consolas"/>
+          <w:sz w:val="17"/>
+        </w:rPr>
+        <w:t>├── README.md               setup, commands and results summary</w:t>
+      </w:r>
+    </w:p>
+    <w:p>
+      <w:pPr>
+        <w:spacing w:after="0" w:line="240" w:lineRule="auto"/>
+        <w:shd w:val="clear" w:color="auto" w:fill="F3F4F6"/>
+      </w:pPr>
+      <w:r>
+        <w:rPr>
+          <w:rFonts w:ascii="Consolas" w:hAnsi="Consolas"/>
+          <w:sz w:val="17"/>
+        </w:rPr>
+        <w:t>├── requirements.txt        Python libraries</w:t>
+      </w:r>
+    </w:p>
+    <w:p>
+      <w:pPr>
+        <w:spacing w:after="0" w:line="240" w:lineRule="auto"/>
+        <w:shd w:val="clear" w:color="auto" w:fill="F3F4F6"/>
+      </w:pPr>
+      <w:r>
+        <w:rPr>
+          <w:rFonts w:ascii="Consolas" w:hAnsi="Consolas"/>
+          <w:sz w:val="17"/>
+        </w:rPr>
+        <w:t>├── src/                    all Python code</w:t>
+      </w:r>
+    </w:p>
+    <w:p>
+      <w:pPr>
+        <w:spacing w:after="0" w:line="240" w:lineRule="auto"/>
+        <w:shd w:val="clear" w:color="auto" w:fill="F3F4F6"/>
+      </w:pPr>
+      <w:r>
+        <w:rPr>
+          <w:rFonts w:ascii="Consolas" w:hAnsi="Consolas"/>
+          <w:sz w:val="17"/>
+        </w:rPr>
+        <w:t>│   ├── xbd.py              reading raw xBD files</w:t>
+      </w:r>
+    </w:p>
+    <w:p>
+      <w:pPr>
+        <w:spacing w:after="0" w:line="240" w:lineRule="auto"/>
+        <w:shd w:val="clear" w:color="auto" w:fill="F3F4F6"/>
+      </w:pPr>
+      <w:r>
+        <w:rPr>
+          <w:rFonts w:ascii="Consolas" w:hAnsi="Consolas"/>
+          <w:sz w:val="17"/>
+        </w:rPr>
+        <w:t>│   ├── preprocess.py       raw GeoTIFFs -&gt; JPEG images + masks</w:t>
+      </w:r>
+    </w:p>
+    <w:p>
+      <w:pPr>
+        <w:spacing w:after="0" w:line="240" w:lineRule="auto"/>
+        <w:shd w:val="clear" w:color="auto" w:fill="F3F4F6"/>
+      </w:pPr>
+      <w:r>
+        <w:rPr>
+          <w:rFonts w:ascii="Consolas" w:hAnsi="Consolas"/>
+          <w:sz w:val="17"/>
+        </w:rPr>
+        <w:t>│   ├── dataset.py          feeding images to the localization model</w:t>
+      </w:r>
+    </w:p>
+    <w:p>
+      <w:pPr>
+        <w:spacing w:after="0" w:line="240" w:lineRule="auto"/>
+        <w:shd w:val="clear" w:color="auto" w:fill="F3F4F6"/>
+      </w:pPr>
+      <w:r>
+        <w:rPr>
+          <w:rFonts w:ascii="Consolas" w:hAnsi="Consolas"/>
+          <w:sz w:val="17"/>
+        </w:rPr>
+        <w:t>│   ├── train.py            localization model: training and scoring</w:t>
+      </w:r>
+    </w:p>
+    <w:p>
+      <w:pPr>
+        <w:spacing w:after="0" w:line="240" w:lineRule="auto"/>
+        <w:shd w:val="clear" w:color="auto" w:fill="F3F4F6"/>
+      </w:pPr>
+      <w:r>
+        <w:rPr>
+          <w:rFonts w:ascii="Consolas" w:hAnsi="Consolas"/>
+          <w:sz w:val="17"/>
+        </w:rPr>
+        <w:t>│   ├── damage.py           damage model: data, training and scoring</w:t>
+      </w:r>
+    </w:p>
+    <w:p>
+      <w:pPr>
+        <w:spacing w:after="0" w:line="240" w:lineRule="auto"/>
+        <w:shd w:val="clear" w:color="auto" w:fill="F3F4F6"/>
+      </w:pPr>
+      <w:r>
+        <w:rPr>
+          <w:rFonts w:ascii="Consolas" w:hAnsi="Consolas"/>
+          <w:sz w:val="17"/>
+        </w:rPr>
+        <w:t>│   ├── predict.py          both models -&gt; buildings on the map</w:t>
+      </w:r>
+    </w:p>
+    <w:p>
+      <w:pPr>
+        <w:spacing w:after="0" w:line="240" w:lineRule="auto"/>
+        <w:shd w:val="clear" w:color="auto" w:fill="F3F4F6"/>
+      </w:pPr>
+      <w:r>
+        <w:rPr>
+          <w:rFonts w:ascii="Consolas" w:hAnsi="Consolas"/>
+          <w:sz w:val="17"/>
+        </w:rPr>
+        <w:t>│   └── progress.py         live training progress in the terminal</w:t>
+      </w:r>
+    </w:p>
+    <w:p>
+      <w:pPr>
+        <w:spacing w:after="0" w:line="240" w:lineRule="auto"/>
+        <w:shd w:val="clear" w:color="auto" w:fill="F3F4F6"/>
+      </w:pPr>
+      <w:r>
+        <w:rPr>
+          <w:rFonts w:ascii="Consolas" w:hAnsi="Consolas"/>
+          <w:sz w:val="17"/>
+        </w:rPr>
+        <w:t>├── notebooks/</w:t>
+      </w:r>
+    </w:p>
+    <w:p>
+      <w:pPr>
+        <w:spacing w:after="0" w:line="240" w:lineRule="auto"/>
+        <w:shd w:val="clear" w:color="auto" w:fill="F3F4F6"/>
+      </w:pPr>
+      <w:r>
+        <w:rPr>
+          <w:rFonts w:ascii="Consolas" w:hAnsi="Consolas"/>
+          <w:sz w:val="17"/>
+        </w:rPr>
+        <w:t>│   ├── 01_explore_xbd.ipynb             dataset exploration</w:t>
+      </w:r>
+    </w:p>
+    <w:p>
+      <w:pPr>
+        <w:spacing w:after="0" w:line="240" w:lineRule="auto"/>
+        <w:shd w:val="clear" w:color="auto" w:fill="F3F4F6"/>
+      </w:pPr>
+      <w:r>
+        <w:rPr>
+          <w:rFonts w:ascii="Consolas" w:hAnsi="Consolas"/>
+          <w:sz w:val="17"/>
+        </w:rPr>
+        <w:t>│   ├── 02_building_localization.ipynb   localization results</w:t>
+      </w:r>
+    </w:p>
+    <w:p>
+      <w:pPr>
+        <w:spacing w:after="0" w:line="240" w:lineRule="auto"/>
+        <w:shd w:val="clear" w:color="auto" w:fill="F3F4F6"/>
+      </w:pPr>
+      <w:r>
+        <w:rPr>
+          <w:rFonts w:ascii="Consolas" w:hAnsi="Consolas"/>
+          <w:sz w:val="17"/>
+        </w:rPr>
+        <w:t>│   └── 03_damage_classification.ipynb   damage results</w:t>
+      </w:r>
+    </w:p>
+    <w:p>
+      <w:pPr>
+        <w:spacing w:after="0" w:line="240" w:lineRule="auto"/>
+        <w:shd w:val="clear" w:color="auto" w:fill="F3F4F6"/>
+      </w:pPr>
+      <w:r>
+        <w:rPr>
+          <w:rFonts w:ascii="Consolas" w:hAnsi="Consolas"/>
+          <w:sz w:val="17"/>
+        </w:rPr>
+        <w:t>├── dashboard/</w:t>
+      </w:r>
+    </w:p>
+    <w:p>
+      <w:pPr>
+        <w:spacing w:after="0" w:line="240" w:lineRule="auto"/>
+        <w:shd w:val="clear" w:color="auto" w:fill="F3F4F6"/>
+      </w:pPr>
+      <w:r>
+        <w:rPr>
+          <w:rFonts w:ascii="Consolas" w:hAnsi="Consolas"/>
+          <w:sz w:val="17"/>
+        </w:rPr>
+        <w:t>│   ├── index.html          the map web page</w:t>
+      </w:r>
+    </w:p>
+    <w:p>
+      <w:pPr>
+        <w:spacing w:after="0" w:line="240" w:lineRule="auto"/>
+        <w:shd w:val="clear" w:color="auto" w:fill="F3F4F6"/>
+      </w:pPr>
+      <w:r>
+        <w:rPr>
+          <w:rFonts w:ascii="Consolas" w:hAnsi="Consolas"/>
+          <w:sz w:val="17"/>
+        </w:rPr>
+        <w:t>│   ├── data/               exported buildings (generated)</w:t>
+      </w:r>
+    </w:p>
+    <w:p>
+      <w:pPr>
+        <w:spacing w:after="0" w:line="240" w:lineRule="auto"/>
+        <w:shd w:val="clear" w:color="auto" w:fill="F3F4F6"/>
+      </w:pPr>
+      <w:r>
+        <w:rPr>
+          <w:rFonts w:ascii="Consolas" w:hAnsi="Consolas"/>
+          <w:sz w:val="17"/>
+        </w:rPr>
+        <w:t>│   └── images/             tile images for the map (generated)</w:t>
+      </w:r>
+    </w:p>
+    <w:p>
+      <w:pPr>
+        <w:spacing w:after="0" w:line="240" w:lineRule="auto"/>
+        <w:shd w:val="clear" w:color="auto" w:fill="F3F4F6"/>
+      </w:pPr>
+      <w:r>
+        <w:rPr>
+          <w:rFonts w:ascii="Consolas" w:hAnsi="Consolas"/>
+          <w:sz w:val="17"/>
+        </w:rPr>
+        <w:t>├── docs/                   this report and its figures</w:t>
+      </w:r>
+    </w:p>
+    <w:p>
+      <w:pPr>
+        <w:spacing w:after="0" w:line="240" w:lineRule="auto"/>
+        <w:shd w:val="clear" w:color="auto" w:fill="F3F4F6"/>
+      </w:pPr>
+      <w:r>
+        <w:rPr>
+          <w:rFonts w:ascii="Consolas" w:hAnsi="Consolas"/>
+          <w:sz w:val="17"/>
+        </w:rPr>
+        <w:t>├── data/                   dataset: raw xbd/ and processed/ (not in git)</w:t>
+      </w:r>
+    </w:p>
+    <w:p>
+      <w:pPr>
+        <w:spacing w:after="0" w:line="240" w:lineRule="auto"/>
+        <w:shd w:val="clear" w:color="auto" w:fill="F3F4F6"/>
+      </w:pPr>
+      <w:r>
+        <w:rPr>
+          <w:rFonts w:ascii="Consolas" w:hAnsi="Consolas"/>
+          <w:sz w:val="17"/>
+        </w:rPr>
+        <w:t>├── runs/                   trained models and logs (not in git)</w:t>
+      </w:r>
+    </w:p>
+    <w:p>
+      <w:pPr>
+        <w:spacing w:after="0" w:line="240" w:lineRule="auto"/>
+        <w:shd w:val="clear" w:color="auto" w:fill="F3F4F6"/>
+      </w:pPr>
+      <w:r>
+        <w:rPr>
+          <w:rFonts w:ascii="Consolas" w:hAnsi="Consolas"/>
+          <w:sz w:val="17"/>
+        </w:rPr>
+        <w:t>└── outputs/                charts and tables from notebook 01</w:t>
+      </w:r>
+    </w:p>
+    <w:p>
+      <w:pPr>
+        <w:spacing w:after="40"/>
+      </w:pPr>
+    </w:p>
+    <w:p>
+      <w:pPr>
+        <w:pStyle w:val="Heading2"/>
+      </w:pPr>
+      <w:r>
+        <w:t>B.2 Running the project from scratch</w:t>
+      </w:r>
+    </w:p>
+    <w:p>
+      <w:r>
+        <w:t>All commands run from the project folder with Anaconda's Python (</w:t>
+      </w:r>
+      <w:r>
+        <w:rPr>
+          <w:rFonts w:ascii="Consolas" w:hAnsi="Consolas"/>
+          <w:sz w:val="19"/>
+        </w:rPr>
+        <w:t>/opt/anaconda3/bin/python3</w:t>
+      </w:r>
+      <w:r>
+        <w:t xml:space="preserve">, written </w:t>
+      </w:r>
+      <w:r>
+        <w:rPr>
+          <w:rFonts w:ascii="Consolas" w:hAnsi="Consolas"/>
+          <w:sz w:val="19"/>
+        </w:rPr>
+        <w:t>python</w:t>
+      </w:r>
+      <w:r>
+        <w:t xml:space="preserve"> below):</w:t>
       </w:r>
     </w:p>
     <w:p>
@@ -7634,7 +8122,709 @@
           <w:b/>
           <w:sz w:val="19"/>
         </w:rPr>
-        <w:t xml:space="preserve">Table 12. </w:t>
+        <w:t xml:space="preserve">Table 13. </w:t>
+      </w:r>
+      <w:r>
+        <w:rPr>
+          <w:i/>
+          <w:color w:val="555F6D"/>
+          <w:sz w:val="19"/>
+        </w:rPr>
+        <w:t>Commands in order.</w:t>
+      </w:r>
+    </w:p>
+    <w:tbl>
+      <w:tblPr>
+        <w:tblStyle w:val="TableGrid"/>
+        <w:tblW w:type="auto" w:w="0"/>
+        <w:jc w:val="center"/>
+        <w:tblLook w:firstColumn="1" w:firstRow="1" w:lastColumn="0" w:lastRow="0" w:noHBand="0" w:noVBand="1" w:val="04A0"/>
+      </w:tblPr>
+      <w:tblGrid>
+        <w:gridCol w:w="3120"/>
+        <w:gridCol w:w="3120"/>
+        <w:gridCol w:w="3120"/>
+      </w:tblGrid>
+      <w:tr>
+        <w:tc>
+          <w:tcPr>
+            <w:tcW w:type="dxa" w:w="2304"/>
+            <w:shd w:val="clear" w:color="auto" w:fill="DCE6F2"/>
+          </w:tcPr>
+          <w:p>
+            <w:pPr>
+              <w:spacing w:after="40"/>
+            </w:pPr>
+            <w:r/>
+            <w:r>
+              <w:rPr>
+                <w:b/>
+                <w:sz w:val="20"/>
+              </w:rPr>
+              <w:t>Step</w:t>
+            </w:r>
+          </w:p>
+        </w:tc>
+        <w:tc>
+          <w:tcPr>
+            <w:tcW w:type="dxa" w:w="5616"/>
+            <w:shd w:val="clear" w:color="auto" w:fill="DCE6F2"/>
+          </w:tcPr>
+          <w:p>
+            <w:pPr>
+              <w:spacing w:after="40"/>
+            </w:pPr>
+            <w:r/>
+            <w:r>
+              <w:rPr>
+                <w:b/>
+                <w:sz w:val="20"/>
+              </w:rPr>
+              <w:t>Command</w:t>
+            </w:r>
+          </w:p>
+        </w:tc>
+        <w:tc>
+          <w:tcPr>
+            <w:tcW w:type="dxa" w:w="1296"/>
+            <w:shd w:val="clear" w:color="auto" w:fill="DCE6F2"/>
+          </w:tcPr>
+          <w:p>
+            <w:pPr>
+              <w:spacing w:after="40"/>
+            </w:pPr>
+            <w:r/>
+            <w:r>
+              <w:rPr>
+                <w:b/>
+                <w:sz w:val="20"/>
+              </w:rPr>
+              <w:t>Time</w:t>
+            </w:r>
+          </w:p>
+        </w:tc>
+      </w:tr>
+      <w:tr>
+        <w:tc>
+          <w:tcPr>
+            <w:tcW w:type="dxa" w:w="2304"/>
+          </w:tcPr>
+          <w:p>
+            <w:pPr>
+              <w:spacing w:after="40"/>
+            </w:pPr>
+            <w:r>
+              <w:rPr>
+                <w:sz w:val="20"/>
+              </w:rPr>
+            </w:r>
+            <w:r>
+              <w:rPr>
+                <w:sz w:val="20"/>
+              </w:rPr>
+              <w:t>1. Install libraries</w:t>
+            </w:r>
+          </w:p>
+        </w:tc>
+        <w:tc>
+          <w:tcPr>
+            <w:tcW w:type="dxa" w:w="5616"/>
+          </w:tcPr>
+          <w:p>
+            <w:pPr>
+              <w:spacing w:after="40"/>
+            </w:pPr>
+            <w:r>
+              <w:rPr>
+                <w:sz w:val="20"/>
+              </w:rPr>
+            </w:r>
+            <w:r>
+              <w:rPr>
+                <w:rFonts w:ascii="Consolas" w:hAnsi="Consolas"/>
+                <w:sz w:val="20"/>
+              </w:rPr>
+              <w:t>python -m pip install -r requirements.txt</w:t>
+            </w:r>
+          </w:p>
+        </w:tc>
+        <w:tc>
+          <w:tcPr>
+            <w:tcW w:type="dxa" w:w="1296"/>
+          </w:tcPr>
+          <w:p>
+            <w:pPr>
+              <w:spacing w:after="40"/>
+            </w:pPr>
+            <w:r>
+              <w:rPr>
+                <w:sz w:val="20"/>
+              </w:rPr>
+            </w:r>
+            <w:r>
+              <w:rPr>
+                <w:sz w:val="20"/>
+              </w:rPr>
+              <w:t>minutes</w:t>
+            </w:r>
+          </w:p>
+        </w:tc>
+      </w:tr>
+      <w:tr>
+        <w:tc>
+          <w:tcPr>
+            <w:tcW w:type="dxa" w:w="2304"/>
+          </w:tcPr>
+          <w:p>
+            <w:pPr>
+              <w:spacing w:after="40"/>
+            </w:pPr>
+            <w:r>
+              <w:rPr>
+                <w:sz w:val="20"/>
+              </w:rPr>
+            </w:r>
+            <w:r>
+              <w:rPr>
+                <w:sz w:val="20"/>
+              </w:rPr>
+              <w:t>2. Convert the data</w:t>
+            </w:r>
+          </w:p>
+        </w:tc>
+        <w:tc>
+          <w:tcPr>
+            <w:tcW w:type="dxa" w:w="5616"/>
+          </w:tcPr>
+          <w:p>
+            <w:pPr>
+              <w:spacing w:after="40"/>
+            </w:pPr>
+            <w:r>
+              <w:rPr>
+                <w:sz w:val="20"/>
+              </w:rPr>
+            </w:r>
+            <w:r>
+              <w:rPr>
+                <w:rFonts w:ascii="Consolas" w:hAnsi="Consolas"/>
+                <w:sz w:val="20"/>
+              </w:rPr>
+              <w:t>python -m src.preprocess</w:t>
+            </w:r>
+          </w:p>
+        </w:tc>
+        <w:tc>
+          <w:tcPr>
+            <w:tcW w:type="dxa" w:w="1296"/>
+          </w:tcPr>
+          <w:p>
+            <w:pPr>
+              <w:spacing w:after="40"/>
+            </w:pPr>
+            <w:r>
+              <w:rPr>
+                <w:sz w:val="20"/>
+              </w:rPr>
+            </w:r>
+            <w:r>
+              <w:rPr>
+                <w:sz w:val="20"/>
+              </w:rPr>
+              <w:t>~5 min</w:t>
+            </w:r>
+          </w:p>
+        </w:tc>
+      </w:tr>
+      <w:tr>
+        <w:tc>
+          <w:tcPr>
+            <w:tcW w:type="dxa" w:w="2304"/>
+          </w:tcPr>
+          <w:p>
+            <w:pPr>
+              <w:spacing w:after="40"/>
+            </w:pPr>
+            <w:r>
+              <w:rPr>
+                <w:sz w:val="20"/>
+              </w:rPr>
+            </w:r>
+            <w:r>
+              <w:rPr>
+                <w:sz w:val="20"/>
+              </w:rPr>
+              <w:t>3. Train localization</w:t>
+            </w:r>
+          </w:p>
+        </w:tc>
+        <w:tc>
+          <w:tcPr>
+            <w:tcW w:type="dxa" w:w="5616"/>
+          </w:tcPr>
+          <w:p>
+            <w:pPr>
+              <w:spacing w:after="40"/>
+            </w:pPr>
+            <w:r>
+              <w:rPr>
+                <w:sz w:val="20"/>
+              </w:rPr>
+            </w:r>
+            <w:r>
+              <w:rPr>
+                <w:rFonts w:ascii="Consolas" w:hAnsi="Consolas"/>
+                <w:sz w:val="20"/>
+              </w:rPr>
+              <w:t>python -m src.train --epochs 30</w:t>
+            </w:r>
+          </w:p>
+        </w:tc>
+        <w:tc>
+          <w:tcPr>
+            <w:tcW w:type="dxa" w:w="1296"/>
+          </w:tcPr>
+          <w:p>
+            <w:pPr>
+              <w:spacing w:after="40"/>
+            </w:pPr>
+            <w:r>
+              <w:rPr>
+                <w:sz w:val="20"/>
+              </w:rPr>
+            </w:r>
+            <w:r>
+              <w:rPr>
+                <w:sz w:val="20"/>
+              </w:rPr>
+              <w:t>~3.5 h</w:t>
+            </w:r>
+          </w:p>
+        </w:tc>
+      </w:tr>
+      <w:tr>
+        <w:tc>
+          <w:tcPr>
+            <w:tcW w:type="dxa" w:w="2304"/>
+          </w:tcPr>
+          <w:p>
+            <w:pPr>
+              <w:spacing w:after="40"/>
+            </w:pPr>
+            <w:r>
+              <w:rPr>
+                <w:sz w:val="20"/>
+              </w:rPr>
+            </w:r>
+            <w:r>
+              <w:rPr>
+                <w:sz w:val="20"/>
+              </w:rPr>
+              <w:t>4. Train damage model (v1)</w:t>
+            </w:r>
+          </w:p>
+        </w:tc>
+        <w:tc>
+          <w:tcPr>
+            <w:tcW w:type="dxa" w:w="5616"/>
+          </w:tcPr>
+          <w:p>
+            <w:pPr>
+              <w:spacing w:after="40"/>
+            </w:pPr>
+            <w:r>
+              <w:rPr>
+                <w:sz w:val="20"/>
+              </w:rPr>
+            </w:r>
+            <w:r>
+              <w:rPr>
+                <w:rFonts w:ascii="Consolas" w:hAnsi="Consolas"/>
+                <w:sz w:val="20"/>
+              </w:rPr>
+              <w:t>python -m src.damage --epochs 30</w:t>
+            </w:r>
+          </w:p>
+        </w:tc>
+        <w:tc>
+          <w:tcPr>
+            <w:tcW w:type="dxa" w:w="1296"/>
+          </w:tcPr>
+          <w:p>
+            <w:pPr>
+              <w:spacing w:after="40"/>
+            </w:pPr>
+            <w:r>
+              <w:rPr>
+                <w:sz w:val="20"/>
+              </w:rPr>
+            </w:r>
+            <w:r>
+              <w:rPr>
+                <w:sz w:val="20"/>
+              </w:rPr>
+              <w:t>~3.5 h</w:t>
+            </w:r>
+          </w:p>
+        </w:tc>
+      </w:tr>
+      <w:tr>
+        <w:tc>
+          <w:tcPr>
+            <w:tcW w:type="dxa" w:w="2304"/>
+          </w:tcPr>
+          <w:p>
+            <w:pPr>
+              <w:spacing w:after="40"/>
+            </w:pPr>
+            <w:r>
+              <w:rPr>
+                <w:sz w:val="20"/>
+              </w:rPr>
+            </w:r>
+            <w:r>
+              <w:rPr>
+                <w:sz w:val="20"/>
+              </w:rPr>
+              <w:t>4b. Fine-tune (v3)</w:t>
+            </w:r>
+          </w:p>
+        </w:tc>
+        <w:tc>
+          <w:tcPr>
+            <w:tcW w:type="dxa" w:w="5616"/>
+          </w:tcPr>
+          <w:p>
+            <w:pPr>
+              <w:spacing w:after="40"/>
+            </w:pPr>
+            <w:r>
+              <w:rPr>
+                <w:sz w:val="20"/>
+              </w:rPr>
+            </w:r>
+            <w:r>
+              <w:rPr>
+                <w:rFonts w:ascii="Consolas" w:hAnsi="Consolas"/>
+                <w:sz w:val="20"/>
+              </w:rPr>
+              <w:t>python -m src.damage --out-dir runs/damage_v3 --train-splits tier1 tier3 --epochs 10 --lr 1e-4 --init-from runs/damage_resnet34/best.pt --class-weights 0.5 1 4 4 3</w:t>
+            </w:r>
+          </w:p>
+        </w:tc>
+        <w:tc>
+          <w:tcPr>
+            <w:tcW w:type="dxa" w:w="1296"/>
+          </w:tcPr>
+          <w:p>
+            <w:pPr>
+              <w:spacing w:after="40"/>
+            </w:pPr>
+            <w:r>
+              <w:rPr>
+                <w:sz w:val="20"/>
+              </w:rPr>
+            </w:r>
+            <w:r>
+              <w:rPr>
+                <w:sz w:val="20"/>
+              </w:rPr>
+              <w:t>~3.3 h</w:t>
+            </w:r>
+          </w:p>
+        </w:tc>
+      </w:tr>
+      <w:tr>
+        <w:tc>
+          <w:tcPr>
+            <w:tcW w:type="dxa" w:w="2304"/>
+          </w:tcPr>
+          <w:p>
+            <w:pPr>
+              <w:spacing w:after="40"/>
+            </w:pPr>
+            <w:r>
+              <w:rPr>
+                <w:sz w:val="20"/>
+              </w:rPr>
+            </w:r>
+            <w:r>
+              <w:rPr>
+                <w:sz w:val="20"/>
+              </w:rPr>
+              <w:t>5. Watch training</w:t>
+            </w:r>
+          </w:p>
+        </w:tc>
+        <w:tc>
+          <w:tcPr>
+            <w:tcW w:type="dxa" w:w="5616"/>
+          </w:tcPr>
+          <w:p>
+            <w:pPr>
+              <w:spacing w:after="40"/>
+            </w:pPr>
+            <w:r>
+              <w:rPr>
+                <w:sz w:val="20"/>
+              </w:rPr>
+            </w:r>
+            <w:r>
+              <w:rPr>
+                <w:rFonts w:ascii="Consolas" w:hAnsi="Consolas"/>
+                <w:sz w:val="20"/>
+              </w:rPr>
+              <w:t>python -m src.progress</w:t>
+            </w:r>
+          </w:p>
+        </w:tc>
+        <w:tc>
+          <w:tcPr>
+            <w:tcW w:type="dxa" w:w="1296"/>
+          </w:tcPr>
+          <w:p>
+            <w:pPr>
+              <w:spacing w:after="40"/>
+            </w:pPr>
+            <w:r>
+              <w:rPr>
+                <w:sz w:val="20"/>
+              </w:rPr>
+            </w:r>
+            <w:r>
+              <w:rPr>
+                <w:sz w:val="20"/>
+              </w:rPr>
+              <w:t>—</w:t>
+            </w:r>
+          </w:p>
+        </w:tc>
+      </w:tr>
+      <w:tr>
+        <w:tc>
+          <w:tcPr>
+            <w:tcW w:type="dxa" w:w="2304"/>
+          </w:tcPr>
+          <w:p>
+            <w:pPr>
+              <w:spacing w:after="40"/>
+            </w:pPr>
+            <w:r>
+              <w:rPr>
+                <w:sz w:val="20"/>
+              </w:rPr>
+            </w:r>
+            <w:r>
+              <w:rPr>
+                <w:sz w:val="20"/>
+              </w:rPr>
+              <w:t>6. Export map data</w:t>
+            </w:r>
+          </w:p>
+        </w:tc>
+        <w:tc>
+          <w:tcPr>
+            <w:tcW w:type="dxa" w:w="5616"/>
+          </w:tcPr>
+          <w:p>
+            <w:pPr>
+              <w:spacing w:after="40"/>
+            </w:pPr>
+            <w:r>
+              <w:rPr>
+                <w:sz w:val="20"/>
+              </w:rPr>
+            </w:r>
+            <w:r>
+              <w:rPr>
+                <w:rFonts w:ascii="Consolas" w:hAnsi="Consolas"/>
+                <w:sz w:val="20"/>
+              </w:rPr>
+              <w:t>python -m src.predict</w:t>
+            </w:r>
+          </w:p>
+        </w:tc>
+        <w:tc>
+          <w:tcPr>
+            <w:tcW w:type="dxa" w:w="1296"/>
+          </w:tcPr>
+          <w:p>
+            <w:pPr>
+              <w:spacing w:after="40"/>
+            </w:pPr>
+            <w:r>
+              <w:rPr>
+                <w:sz w:val="20"/>
+              </w:rPr>
+            </w:r>
+            <w:r>
+              <w:rPr>
+                <w:sz w:val="20"/>
+              </w:rPr>
+              <w:t>~25 min</w:t>
+            </w:r>
+          </w:p>
+        </w:tc>
+      </w:tr>
+      <w:tr>
+        <w:tc>
+          <w:tcPr>
+            <w:tcW w:type="dxa" w:w="2304"/>
+          </w:tcPr>
+          <w:p>
+            <w:pPr>
+              <w:spacing w:after="40"/>
+            </w:pPr>
+            <w:r>
+              <w:rPr>
+                <w:sz w:val="20"/>
+              </w:rPr>
+            </w:r>
+            <w:r>
+              <w:rPr>
+                <w:sz w:val="20"/>
+              </w:rPr>
+              <w:t>7. Open the dashboard</w:t>
+            </w:r>
+          </w:p>
+        </w:tc>
+        <w:tc>
+          <w:tcPr>
+            <w:tcW w:type="dxa" w:w="5616"/>
+          </w:tcPr>
+          <w:p>
+            <w:pPr>
+              <w:spacing w:after="40"/>
+            </w:pPr>
+            <w:r>
+              <w:rPr>
+                <w:sz w:val="20"/>
+              </w:rPr>
+            </w:r>
+            <w:r>
+              <w:rPr>
+                <w:rFonts w:ascii="Consolas" w:hAnsi="Consolas"/>
+                <w:sz w:val="20"/>
+              </w:rPr>
+              <w:t>python -m http.server 8000 -d dashboard</w:t>
+            </w:r>
+            <w:r>
+              <w:rPr>
+                <w:sz w:val="20"/>
+              </w:rPr>
+              <w:t>, then visit localhost:8000</w:t>
+            </w:r>
+          </w:p>
+        </w:tc>
+        <w:tc>
+          <w:tcPr>
+            <w:tcW w:type="dxa" w:w="1296"/>
+          </w:tcPr>
+          <w:p>
+            <w:pPr>
+              <w:spacing w:after="40"/>
+            </w:pPr>
+            <w:r>
+              <w:rPr>
+                <w:sz w:val="20"/>
+              </w:rPr>
+            </w:r>
+            <w:r>
+              <w:rPr>
+                <w:sz w:val="20"/>
+              </w:rPr>
+              <w:t>—</w:t>
+            </w:r>
+          </w:p>
+        </w:tc>
+      </w:tr>
+      <w:tr>
+        <w:tc>
+          <w:tcPr>
+            <w:tcW w:type="dxa" w:w="2304"/>
+          </w:tcPr>
+          <w:p>
+            <w:pPr>
+              <w:spacing w:after="40"/>
+            </w:pPr>
+            <w:r>
+              <w:rPr>
+                <w:sz w:val="20"/>
+              </w:rPr>
+            </w:r>
+            <w:r>
+              <w:rPr>
+                <w:sz w:val="20"/>
+              </w:rPr>
+              <w:t>8. Rebuild this report</w:t>
+            </w:r>
+          </w:p>
+        </w:tc>
+        <w:tc>
+          <w:tcPr>
+            <w:tcW w:type="dxa" w:w="5616"/>
+          </w:tcPr>
+          <w:p>
+            <w:pPr>
+              <w:spacing w:after="40"/>
+            </w:pPr>
+            <w:r>
+              <w:rPr>
+                <w:sz w:val="20"/>
+              </w:rPr>
+            </w:r>
+            <w:r>
+              <w:rPr>
+                <w:rFonts w:ascii="Consolas" w:hAnsi="Consolas"/>
+                <w:sz w:val="20"/>
+              </w:rPr>
+              <w:t>python docs/build_report.py</w:t>
+            </w:r>
+          </w:p>
+        </w:tc>
+        <w:tc>
+          <w:tcPr>
+            <w:tcW w:type="dxa" w:w="1296"/>
+          </w:tcPr>
+          <w:p>
+            <w:pPr>
+              <w:spacing w:after="40"/>
+            </w:pPr>
+            <w:r>
+              <w:rPr>
+                <w:sz w:val="20"/>
+              </w:rPr>
+            </w:r>
+            <w:r>
+              <w:rPr>
+                <w:sz w:val="20"/>
+              </w:rPr>
+              <w:t>seconds</w:t>
+            </w:r>
+          </w:p>
+        </w:tc>
+      </w:tr>
+    </w:tbl>
+    <w:p/>
+    <w:p>
+      <w:pPr>
+        <w:pStyle w:val="Heading2"/>
+      </w:pPr>
+      <w:r>
+        <w:t>B.3 How data flows between files</w:t>
+      </w:r>
+    </w:p>
+    <w:p>
+      <w:pPr>
+        <w:keepNext/>
+        <w:jc w:val="center"/>
+      </w:pPr>
+      <w:r>
+        <w:rPr>
+          <w:b/>
+          <w:sz w:val="19"/>
+        </w:rPr>
+        <w:t xml:space="preserve">Table 14. </w:t>
       </w:r>
       <w:r>
         <w:rPr>

</xml_diff>